<commit_message>
docs -- NI: preparing for the exam a little
</commit_message>
<xml_diff>
--- a/42P Praktyka/Звіт.docx
+++ b/42P Praktyka/Звіт.docx
@@ -1032,16 +1032,25 @@
           <w:szCs w:val="28"/>
           <w:lang w:val="uk-UA"/>
         </w:rPr>
-        <w:t>Пояснювальна записка містить: 3</w:t>
+        <w:t xml:space="preserve">Пояснювальна записка містить: </w:t>
       </w:r>
       <w:r>
         <w:rPr>
           <w:rFonts w:eastAsia="Times New Roman" w:cs="Times New Roman"/>
           <w:sz w:val="28"/>
           <w:szCs w:val="28"/>
+          <w:lang w:val="uk-UA"/>
+        </w:rPr>
+        <w:t>11</w:t>
+      </w:r>
+      <w:r>
+        <w:rPr>
+          <w:rFonts w:eastAsia="Times New Roman" w:cs="Times New Roman"/>
+          <w:sz w:val="28"/>
+          <w:szCs w:val="28"/>
           <w:lang w:val="en-US"/>
         </w:rPr>
-        <w:t xml:space="preserve">9 </w:t>
+        <w:t xml:space="preserve"> </w:t>
       </w:r>
       <w:r>
         <w:rPr>
@@ -1050,25 +1059,7 @@
           <w:szCs w:val="28"/>
           <w:lang w:val="uk-UA"/>
         </w:rPr>
-        <w:t>сторінок, 15 рисунків, 11</w:t>
-      </w:r>
-      <w:r>
-        <w:rPr>
-          <w:rFonts w:eastAsia="Times New Roman" w:cs="Times New Roman"/>
-          <w:sz w:val="28"/>
-          <w:szCs w:val="28"/>
-          <w:lang w:val="en-US"/>
-        </w:rPr>
-        <w:t xml:space="preserve"> </w:t>
-      </w:r>
-      <w:r>
-        <w:rPr>
-          <w:rFonts w:eastAsia="Times New Roman" w:cs="Times New Roman"/>
-          <w:sz w:val="28"/>
-          <w:szCs w:val="28"/>
-          <w:lang w:val="uk-UA"/>
-        </w:rPr>
-        <w:t>таблиць.</w:t>
+        <w:t>сторінок.</w:t>
       </w:r>
     </w:p>
     <w:p>
@@ -1472,6 +1463,111 @@
             </w:tabs>
             <w:rPr/>
           </w:pPr>
+          <w:hyperlink w:anchor="__RefHeading___Toc16725_2705807760" w:tooltip="2 Проходження техніки безпеки">
+            <w:r>
+              <w:rPr>
+                <w:rStyle w:val="Style18"/>
+                <w:webHidden/>
+              </w:rPr>
+              <w:t>2 Проходження техніки безпеки</w:t>
+              <w:tab/>
+              <w:t>6</w:t>
+            </w:r>
+          </w:hyperlink>
+        </w:p>
+        <w:p>
+          <w:pPr>
+            <w:pStyle w:val="TOC1"/>
+            <w:tabs>
+              <w:tab w:val="clear" w:pos="9344"/>
+              <w:tab w:val="right" w:pos="9353" w:leader="dot"/>
+            </w:tabs>
+            <w:rPr/>
+          </w:pPr>
+          <w:hyperlink w:anchor="__RefHeading___Toc16727_2705807760" w:tooltip="3 Отримання завдання">
+            <w:r>
+              <w:rPr>
+                <w:rStyle w:val="Style18"/>
+                <w:webHidden/>
+              </w:rPr>
+              <w:t>3 Отримання завдання</w:t>
+              <w:tab/>
+              <w:t>7</w:t>
+            </w:r>
+          </w:hyperlink>
+        </w:p>
+        <w:p>
+          <w:pPr>
+            <w:pStyle w:val="TOC1"/>
+            <w:tabs>
+              <w:tab w:val="clear" w:pos="9344"/>
+              <w:tab w:val="right" w:pos="9353" w:leader="dot"/>
+            </w:tabs>
+            <w:rPr/>
+          </w:pPr>
+          <w:hyperlink w:anchor="__RefHeading___Toc16729_2705807760" w:tooltip="4 План виконання">
+            <w:r>
+              <w:rPr>
+                <w:rStyle w:val="Style18"/>
+                <w:webHidden/>
+              </w:rPr>
+              <w:t>4 План виконання</w:t>
+              <w:tab/>
+              <w:t>8</w:t>
+            </w:r>
+          </w:hyperlink>
+        </w:p>
+        <w:p>
+          <w:pPr>
+            <w:pStyle w:val="TOC1"/>
+            <w:tabs>
+              <w:tab w:val="clear" w:pos="9344"/>
+              <w:tab w:val="right" w:pos="9353" w:leader="dot"/>
+            </w:tabs>
+            <w:rPr/>
+          </w:pPr>
+          <w:hyperlink w:anchor="__RefHeading___Toc16731_2705807760" w:tooltip="5 Надані помилки">
+            <w:r>
+              <w:rPr>
+                <w:rStyle w:val="Style18"/>
+                <w:webHidden/>
+              </w:rPr>
+              <w:t>5 Надані помилки</w:t>
+              <w:tab/>
+              <w:t>9</w:t>
+            </w:r>
+          </w:hyperlink>
+        </w:p>
+        <w:p>
+          <w:pPr>
+            <w:pStyle w:val="TOC1"/>
+            <w:tabs>
+              <w:tab w:val="clear" w:pos="9344"/>
+              <w:tab w:val="right" w:pos="9353" w:leader="dot"/>
+            </w:tabs>
+            <w:rPr/>
+          </w:pPr>
+          <w:hyperlink w:anchor="__RefHeading___Toc16733_2705807760" w:tooltip="6 Прийняття роботи">
+            <w:r>
+              <w:rPr>
+                <w:rStyle w:val="Style18"/>
+                <w:webHidden/>
+              </w:rPr>
+              <w:t>6 Прийняття роботи</w:t>
+              <w:tab/>
+              <w:t>10</w:t>
+            </w:r>
+          </w:hyperlink>
+        </w:p>
+        <w:p>
+          <w:pPr>
+            <w:pStyle w:val="TOC1"/>
+            <w:tabs>
+              <w:tab w:val="clear" w:pos="9344"/>
+              <w:tab w:val="right" w:pos="9353" w:leader="dot"/>
+            </w:tabs>
+            <w:rPr/>
+          </w:pPr>
           <w:hyperlink w:anchor="__RefHeading___Toc16696_2705807760" w:tooltip="Список використаних джерел">
             <w:r>
               <w:rPr>
@@ -1480,7 +1576,7 @@
               </w:rPr>
               <w:t>Список використаних джерел</w:t>
               <w:tab/>
-              <w:t>6</w:t>
+              <w:t>11</w:t>
             </w:r>
           </w:hyperlink>
           <w:r>
@@ -1971,6 +2067,8 @@
         <w:pStyle w:val="Title1st"/>
         <w:rPr/>
       </w:pPr>
+      <w:bookmarkStart w:id="30" w:name="__RefHeading___Toc16725_2705807760"/>
+      <w:bookmarkEnd w:id="30"/>
       <w:r>
         <w:rPr/>
         <w:t>2 Проходження техніки безпеки</w:t>
@@ -2032,6 +2130,8 @@
         <w:pStyle w:val="Title1st"/>
         <w:rPr/>
       </w:pPr>
+      <w:bookmarkStart w:id="31" w:name="__RefHeading___Toc16727_2705807760"/>
+      <w:bookmarkEnd w:id="31"/>
       <w:r>
         <w:rPr/>
         <w:t>3 Отримання завдання</w:t>
@@ -2086,6 +2186,8 @@
         <w:pStyle w:val="Title1st"/>
         <w:rPr/>
       </w:pPr>
+      <w:bookmarkStart w:id="32" w:name="__RefHeading___Toc16729_2705807760"/>
+      <w:bookmarkEnd w:id="32"/>
       <w:r>
         <w:rPr/>
         <w:t>4 План виконання</w:t>
@@ -2094,6 +2196,104 @@
     <w:p>
       <w:pPr>
         <w:pStyle w:val="Common"/>
+        <w:rPr>
+          <w:lang w:val="uk-UA"/>
+        </w:rPr>
+      </w:pPr>
+      <w:r>
+        <w:rPr>
+          <w:lang w:val="uk-UA"/>
+        </w:rPr>
+        <w:t>Заплановано створити 5 сторінок.</w:t>
+      </w:r>
+    </w:p>
+    <w:p>
+      <w:pPr>
+        <w:pStyle w:val="Common"/>
+        <w:rPr>
+          <w:lang w:val="uk-UA"/>
+        </w:rPr>
+      </w:pPr>
+      <w:r>
+        <w:rPr>
+          <w:lang w:val="uk-UA"/>
+        </w:rPr>
+        <w:t>План розробки кожної:</w:t>
+      </w:r>
+    </w:p>
+    <w:p>
+      <w:pPr>
+        <w:pStyle w:val="Common"/>
+        <w:rPr>
+          <w:lang w:val="uk-UA"/>
+        </w:rPr>
+      </w:pPr>
+      <w:r>
+        <w:rPr>
+          <w:lang w:val="uk-UA"/>
+        </w:rPr>
+        <w:t>1. Сторінка кредитів: можна переглянути взяті кредити, можна їх сплатити.</w:t>
+      </w:r>
+    </w:p>
+    <w:p>
+      <w:pPr>
+        <w:pStyle w:val="Common"/>
+        <w:rPr>
+          <w:lang w:val="uk-UA"/>
+        </w:rPr>
+      </w:pPr>
+      <w:r>
+        <w:rPr>
+          <w:lang w:val="uk-UA"/>
+        </w:rPr>
+        <w:t>2. Сторінка гаража: можна переглянути придбані вантажівки, обрати їх.</w:t>
+      </w:r>
+    </w:p>
+    <w:p>
+      <w:pPr>
+        <w:pStyle w:val="Common"/>
+        <w:rPr>
+          <w:lang w:val="uk-UA"/>
+        </w:rPr>
+      </w:pPr>
+      <w:r>
+        <w:rPr>
+          <w:lang w:val="uk-UA"/>
+        </w:rPr>
+        <w:t>3. Сторінка автосалону: можна переглянути наявні вантажівки та купити будь-яку з них.</w:t>
+      </w:r>
+    </w:p>
+    <w:p>
+      <w:pPr>
+        <w:pStyle w:val="Common"/>
+        <w:rPr>
+          <w:lang w:val="uk-UA"/>
+        </w:rPr>
+      </w:pPr>
+      <w:r>
+        <w:rPr>
+          <w:lang w:val="uk-UA"/>
+        </w:rPr>
+        <w:t>4. Сторінка банку: можна переглянути доступні кредити та взяти будь-який з них.</w:t>
+      </w:r>
+    </w:p>
+    <w:p>
+      <w:pPr>
+        <w:pStyle w:val="Common"/>
+        <w:rPr>
+          <w:lang w:val="uk-UA"/>
+        </w:rPr>
+      </w:pPr>
+      <w:r>
+        <w:rPr>
+          <w:lang w:val="uk-UA"/>
+        </w:rPr>
+        <w:t>5. Сторінка замовлень: можна здійснити замовлення та переглянути мапу.</w:t>
+      </w:r>
+    </w:p>
+    <w:p>
+      <w:pPr>
+        <w:pStyle w:val="Common"/>
         <w:rPr/>
       </w:pPr>
       <w:r>
@@ -2108,8 +2308,56 @@
         <w:pStyle w:val="Title1st"/>
         <w:rPr/>
       </w:pPr>
-      <w:bookmarkStart w:id="30" w:name="__RefHeading___Toc16696_2705807760"/>
-      <w:bookmarkEnd w:id="30"/>
+      <w:bookmarkStart w:id="33" w:name="__RefHeading___Toc16731_2705807760"/>
+      <w:bookmarkEnd w:id="33"/>
+      <w:r>
+        <w:rPr/>
+        <w:t>5 Надані помилки</w:t>
+      </w:r>
+    </w:p>
+    <w:p>
+      <w:pPr>
+        <w:pStyle w:val="Common"/>
+        <w:rPr/>
+      </w:pPr>
+      <w:r>
+        <w:rPr/>
+      </w:r>
+      <w:r>
+        <w:br w:type="page"/>
+      </w:r>
+    </w:p>
+    <w:p>
+      <w:pPr>
+        <w:pStyle w:val="Title1st"/>
+        <w:rPr/>
+      </w:pPr>
+      <w:bookmarkStart w:id="34" w:name="__RefHeading___Toc16733_2705807760"/>
+      <w:bookmarkEnd w:id="34"/>
+      <w:r>
+        <w:rPr/>
+        <w:t>6 Прийняття роботи</w:t>
+      </w:r>
+    </w:p>
+    <w:p>
+      <w:pPr>
+        <w:pStyle w:val="Common"/>
+        <w:rPr/>
+      </w:pPr>
+      <w:r>
+        <w:rPr/>
+      </w:r>
+      <w:r>
+        <w:br w:type="page"/>
+      </w:r>
+    </w:p>
+    <w:p>
+      <w:pPr>
+        <w:pStyle w:val="Title1st"/>
+        <w:rPr/>
+      </w:pPr>
+      <w:bookmarkStart w:id="35" w:name="__RefHeading___Toc16696_2705807760"/>
+      <w:bookmarkEnd w:id="35"/>
       <w:r>
         <w:rPr/>
         <w:t>Список використаних джерел</w:t>
@@ -2219,7 +2467,7 @@
     </w:r>
     <w:r>
       <w:rPr/>
-      <w:t>9</w:t>
+      <w:t>11</w:t>
     </w:r>
     <w:r>
       <w:rPr/>

</xml_diff>

<commit_message>
docs -- AM: finish the course, Jesus thank you
</commit_message>
<xml_diff>
--- a/42P Praktyka/Звіт.docx
+++ b/42P Praktyka/Звіт.docx
@@ -386,25 +386,7 @@
           <w:szCs w:val="28"/>
           <w:lang w:val="uk-UA"/>
         </w:rPr>
-        <w:t xml:space="preserve">З проходження </w:t>
-      </w:r>
-      <w:r>
-        <w:rPr>
-          <w:rFonts w:ascii="Times New Roman" w:hAnsi="Times New Roman"/>
-          <w:sz w:val="28"/>
-          <w:szCs w:val="28"/>
-          <w:lang w:val="uk-UA"/>
-        </w:rPr>
-        <w:t>переддипломної</w:t>
-      </w:r>
-      <w:r>
-        <w:rPr>
-          <w:rFonts w:ascii="Times New Roman" w:hAnsi="Times New Roman"/>
-          <w:sz w:val="28"/>
-          <w:szCs w:val="28"/>
-          <w:lang w:val="uk-UA"/>
-        </w:rPr>
-        <w:t xml:space="preserve"> практики</w:t>
+        <w:t>З проходження переддипломної практики</w:t>
       </w:r>
     </w:p>
     <w:p>
@@ -427,16 +409,7 @@
           <w:szCs w:val="28"/>
           <w:lang w:val="uk-UA"/>
         </w:rPr>
-        <w:t xml:space="preserve">в компанії </w:t>
-      </w:r>
-      <w:r>
-        <w:rPr>
-          <w:rFonts w:ascii="Times New Roman" w:hAnsi="Times New Roman"/>
-          <w:sz w:val="28"/>
-          <w:szCs w:val="28"/>
-          <w:lang w:val="uk-UA"/>
-        </w:rPr>
-        <w:t>Інфоком ЛТД</w:t>
+        <w:t>в компанії Інфоком ЛТД</w:t>
       </w:r>
     </w:p>
     <w:p>
@@ -719,14 +692,6 @@
         <w:tab/>
         <w:tab/>
         <w:tab/>
-      </w:r>
-      <w:r>
-        <w:rPr>
-          <w:rFonts w:ascii="Times New Roman" w:hAnsi="Times New Roman"/>
-          <w:sz w:val="28"/>
-          <w:szCs w:val="28"/>
-          <w:lang w:val="uk-UA"/>
-        </w:rPr>
         <w:t>Никонова К.В.</w:t>
       </w:r>
     </w:p>
@@ -992,12 +957,12 @@
         </w:rPr>
       </w:pPr>
       <w:bookmarkStart w:id="2" w:name="__RefHeading___Toc6870_2826538368"/>
-      <w:bookmarkStart w:id="3" w:name="_Зміст000138"/>
-      <w:bookmarkStart w:id="4" w:name="_Зміст000066"/>
-      <w:bookmarkStart w:id="5" w:name="_Зміст000029"/>
-      <w:bookmarkStart w:id="6" w:name="_Зміст000003"/>
-      <w:bookmarkStart w:id="7" w:name="_Toc196826519"/>
-      <w:bookmarkStart w:id="8" w:name="_Toc27554778"/>
+      <w:bookmarkStart w:id="3" w:name="_Toc27554778"/>
+      <w:bookmarkStart w:id="4" w:name="_Toc196826519"/>
+      <w:bookmarkStart w:id="5" w:name="_Зміст000003"/>
+      <w:bookmarkStart w:id="6" w:name="_Зміст000029"/>
+      <w:bookmarkStart w:id="7" w:name="_Зміст000066"/>
+      <w:bookmarkStart w:id="8" w:name="_Зміст000138"/>
       <w:bookmarkEnd w:id="2"/>
       <w:r>
         <w:rPr>
@@ -1032,25 +997,54 @@
           <w:szCs w:val="28"/>
           <w:lang w:val="uk-UA"/>
         </w:rPr>
-        <w:t xml:space="preserve">Пояснювальна записка містить: </w:t>
+        <w:t>Пояснювальна записка містить: 11</w:t>
       </w:r>
       <w:r>
         <w:rPr>
           <w:rFonts w:eastAsia="Times New Roman" w:cs="Times New Roman"/>
           <w:sz w:val="28"/>
           <w:szCs w:val="28"/>
-          <w:lang w:val="uk-UA"/>
-        </w:rPr>
-        <w:t>11</w:t>
+          <w:lang w:val="en-US"/>
+        </w:rPr>
+        <w:t xml:space="preserve"> </w:t>
       </w:r>
       <w:r>
         <w:rPr>
           <w:rFonts w:eastAsia="Times New Roman" w:cs="Times New Roman"/>
           <w:sz w:val="28"/>
           <w:szCs w:val="28"/>
+          <w:lang w:val="uk-UA"/>
+        </w:rPr>
+        <w:t>сторінок.</w:t>
+      </w:r>
+    </w:p>
+    <w:p>
+      <w:pPr>
+        <w:pStyle w:val="Common"/>
+        <w:rPr>
+          <w:rFonts w:ascii="Times New Roman" w:hAnsi="Times New Roman"/>
+          <w:sz w:val="28"/>
+          <w:szCs w:val="28"/>
+          <w:lang w:val="uk-UA"/>
+        </w:rPr>
+      </w:pPr>
+      <w:r>
+        <w:rPr>
+          <w:rFonts w:eastAsia="Times New Roman" w:cs="Times New Roman"/>
+          <w:sz w:val="28"/>
+          <w:szCs w:val="28"/>
+          <w:lang w:val="uk-UA"/>
+        </w:rPr>
+        <w:t xml:space="preserve">ДИПЛОМ, ПЕРЕДДИПЛОМНА ПРАКТИКА, </w:t>
+      </w:r>
+      <w:r>
+        <w:rPr>
+          <w:rFonts w:eastAsia="Times New Roman" w:cs="Times New Roman"/>
+          <w:sz w:val="28"/>
+          <w:szCs w:val="28"/>
           <w:lang w:val="en-US"/>
         </w:rPr>
-        <w:t xml:space="preserve"> </w:t>
+        <w:t xml:space="preserve">NICEGUI, PYTHON, </w:t>
       </w:r>
       <w:r>
         <w:rPr>
@@ -1059,7 +1053,7 @@
           <w:szCs w:val="28"/>
           <w:lang w:val="uk-UA"/>
         </w:rPr>
-        <w:t>сторінок.</w:t>
+        <w:t>ВЕБ-ЗАСТОСУНОК</w:t>
       </w:r>
     </w:p>
     <w:p>
@@ -1069,7 +1063,6 @@
           <w:rFonts w:ascii="Times New Roman" w:hAnsi="Times New Roman"/>
           <w:sz w:val="28"/>
           <w:szCs w:val="28"/>
-          <w:lang w:val="uk-UA"/>
         </w:rPr>
       </w:pPr>
       <w:r>
@@ -1079,17 +1072,38 @@
           <w:szCs w:val="28"/>
           <w:lang w:val="uk-UA"/>
         </w:rPr>
-        <w:t xml:space="preserve">ДИПЛОМ, ПЕРЕДДИПЛОМНА ПРАКТИКА, </w:t>
-      </w:r>
+        <w:t>Тема роботи — веб-застосунок продажу вантажних автомобілів.</w:t>
+      </w:r>
+    </w:p>
+    <w:p>
+      <w:pPr>
+        <w:pStyle w:val="Common"/>
+        <w:rPr>
+          <w:rFonts w:ascii="Times New Roman" w:hAnsi="Times New Roman"/>
+          <w:sz w:val="28"/>
+          <w:szCs w:val="28"/>
+        </w:rPr>
+      </w:pPr>
       <w:r>
         <w:rPr>
           <w:rFonts w:eastAsia="Times New Roman" w:cs="Times New Roman"/>
           <w:sz w:val="28"/>
           <w:szCs w:val="28"/>
-          <w:lang w:val="en-US"/>
-        </w:rPr>
-        <w:t xml:space="preserve">NICEGUI, PYTHON, </w:t>
-      </w:r>
+          <w:lang w:val="uk-UA"/>
+        </w:rPr>
+        <w:t>Мета роботи — мінімізувати час на вибір та придбання вантажівок.</w:t>
+      </w:r>
+    </w:p>
+    <w:p>
+      <w:pPr>
+        <w:pStyle w:val="Common"/>
+        <w:rPr>
+          <w:rFonts w:ascii="Times New Roman" w:hAnsi="Times New Roman" w:eastAsia="Times New Roman" w:cs="Times New Roman"/>
+          <w:sz w:val="28"/>
+          <w:szCs w:val="28"/>
+          <w:lang w:val="uk-UA"/>
+        </w:rPr>
+      </w:pPr>
       <w:r>
         <w:rPr>
           <w:rFonts w:eastAsia="Times New Roman" w:cs="Times New Roman"/>
@@ -1097,16 +1111,17 @@
           <w:szCs w:val="28"/>
           <w:lang w:val="uk-UA"/>
         </w:rPr>
-        <w:t>ВЕБ-ЗАСТОСУНОК</w:t>
+        <w:t>Опис задачі — розробити проєкт та заповнити звіт.</w:t>
       </w:r>
     </w:p>
     <w:p>
       <w:pPr>
         <w:pStyle w:val="Common"/>
         <w:rPr>
-          <w:rFonts w:ascii="Times New Roman" w:hAnsi="Times New Roman"/>
-          <w:sz w:val="28"/>
-          <w:szCs w:val="28"/>
+          <w:rFonts w:ascii="Times New Roman" w:hAnsi="Times New Roman" w:eastAsia="Times New Roman" w:cs="Times New Roman"/>
+          <w:sz w:val="28"/>
+          <w:szCs w:val="28"/>
+          <w:lang w:val="uk-UA"/>
         </w:rPr>
       </w:pPr>
       <w:r>
@@ -1116,8 +1131,19 @@
           <w:szCs w:val="28"/>
           <w:lang w:val="uk-UA"/>
         </w:rPr>
-        <w:t xml:space="preserve">Тема роботи — </w:t>
-      </w:r>
+        <w:t>Що було зроблено:</w:t>
+      </w:r>
+    </w:p>
+    <w:p>
+      <w:pPr>
+        <w:pStyle w:val="Common"/>
+        <w:rPr>
+          <w:rFonts w:ascii="Times New Roman" w:hAnsi="Times New Roman" w:eastAsia="Times New Roman" w:cs="Times New Roman"/>
+          <w:sz w:val="28"/>
+          <w:szCs w:val="28"/>
+          <w:lang w:val="uk-UA"/>
+        </w:rPr>
+      </w:pPr>
       <w:r>
         <w:rPr>
           <w:rFonts w:eastAsia="Times New Roman" w:cs="Times New Roman"/>
@@ -1125,149 +1151,7 @@
           <w:szCs w:val="28"/>
           <w:lang w:val="uk-UA"/>
         </w:rPr>
-        <w:t>веб-застосунок продажу вантажних автомобілів</w:t>
-      </w:r>
-      <w:r>
-        <w:rPr>
-          <w:rFonts w:eastAsia="Times New Roman" w:cs="Times New Roman"/>
-          <w:sz w:val="28"/>
-          <w:szCs w:val="28"/>
-          <w:lang w:val="uk-UA"/>
-        </w:rPr>
-        <w:t>.</w:t>
-      </w:r>
-    </w:p>
-    <w:p>
-      <w:pPr>
-        <w:pStyle w:val="Common"/>
-        <w:rPr>
-          <w:rFonts w:ascii="Times New Roman" w:hAnsi="Times New Roman"/>
-          <w:sz w:val="28"/>
-          <w:szCs w:val="28"/>
-        </w:rPr>
-      </w:pPr>
-      <w:r>
-        <w:rPr>
-          <w:rFonts w:eastAsia="Times New Roman" w:cs="Times New Roman"/>
-          <w:sz w:val="28"/>
-          <w:szCs w:val="28"/>
-          <w:lang w:val="uk-UA"/>
-        </w:rPr>
-        <w:t xml:space="preserve">Мета роботи — </w:t>
-      </w:r>
-      <w:r>
-        <w:rPr>
-          <w:rFonts w:eastAsia="Times New Roman" w:cs="Times New Roman"/>
-          <w:sz w:val="28"/>
-          <w:szCs w:val="28"/>
-          <w:lang w:val="uk-UA"/>
-        </w:rPr>
-        <w:t>мінімізувати час на вибір та придбання вантажівок.</w:t>
-      </w:r>
-    </w:p>
-    <w:p>
-      <w:pPr>
-        <w:pStyle w:val="Common"/>
-        <w:rPr>
-          <w:rFonts w:ascii="Times New Roman" w:hAnsi="Times New Roman" w:eastAsia="Times New Roman" w:cs="Times New Roman"/>
-          <w:sz w:val="28"/>
-          <w:szCs w:val="28"/>
-          <w:lang w:val="uk-UA"/>
-        </w:rPr>
-      </w:pPr>
-      <w:r>
-        <w:rPr>
-          <w:rFonts w:eastAsia="Times New Roman" w:cs="Times New Roman"/>
-          <w:sz w:val="28"/>
-          <w:szCs w:val="28"/>
-          <w:lang w:val="uk-UA"/>
-        </w:rPr>
-        <w:t xml:space="preserve">Опис задачі — </w:t>
-      </w:r>
-      <w:r>
-        <w:rPr>
-          <w:rFonts w:eastAsia="Times New Roman" w:cs="Times New Roman"/>
-          <w:sz w:val="28"/>
-          <w:szCs w:val="28"/>
-          <w:lang w:val="uk-UA"/>
-        </w:rPr>
-        <w:t>розробити проєкт та заповнити звіт</w:t>
-      </w:r>
-      <w:r>
-        <w:rPr>
-          <w:rFonts w:eastAsia="Times New Roman" w:cs="Times New Roman"/>
-          <w:sz w:val="28"/>
-          <w:szCs w:val="28"/>
-          <w:lang w:val="uk-UA"/>
-        </w:rPr>
-        <w:t>.</w:t>
-      </w:r>
-    </w:p>
-    <w:p>
-      <w:pPr>
-        <w:pStyle w:val="Common"/>
-        <w:rPr>
-          <w:rFonts w:ascii="Times New Roman" w:hAnsi="Times New Roman" w:eastAsia="Times New Roman" w:cs="Times New Roman"/>
-          <w:sz w:val="28"/>
-          <w:szCs w:val="28"/>
-          <w:lang w:val="uk-UA"/>
-        </w:rPr>
-      </w:pPr>
-      <w:r>
-        <w:rPr>
-          <w:rFonts w:eastAsia="Times New Roman" w:cs="Times New Roman"/>
-          <w:sz w:val="28"/>
-          <w:szCs w:val="28"/>
-          <w:lang w:val="uk-UA"/>
-        </w:rPr>
-        <w:t xml:space="preserve">Що було </w:t>
-      </w:r>
-      <w:r>
-        <w:rPr>
-          <w:rFonts w:eastAsia="Times New Roman" w:cs="Times New Roman"/>
-          <w:sz w:val="28"/>
-          <w:szCs w:val="28"/>
-          <w:lang w:val="uk-UA"/>
-        </w:rPr>
-        <w:t>зроблено</w:t>
-      </w:r>
-      <w:r>
-        <w:rPr>
-          <w:rFonts w:eastAsia="Times New Roman" w:cs="Times New Roman"/>
-          <w:sz w:val="28"/>
-          <w:szCs w:val="28"/>
-          <w:lang w:val="uk-UA"/>
-        </w:rPr>
-        <w:t>:</w:t>
-      </w:r>
-    </w:p>
-    <w:p>
-      <w:pPr>
-        <w:pStyle w:val="Common"/>
-        <w:rPr>
-          <w:rFonts w:ascii="Times New Roman" w:hAnsi="Times New Roman" w:eastAsia="Times New Roman" w:cs="Times New Roman"/>
-          <w:sz w:val="28"/>
-          <w:szCs w:val="28"/>
-          <w:lang w:val="uk-UA"/>
-        </w:rPr>
-      </w:pPr>
-      <w:r>
-        <w:rPr>
-          <w:rFonts w:eastAsia="Times New Roman" w:cs="Times New Roman"/>
-          <w:sz w:val="28"/>
-          <w:szCs w:val="28"/>
-          <w:lang w:val="uk-UA"/>
-        </w:rPr>
-        <w:t xml:space="preserve">- </w:t>
-      </w:r>
-      <w:r>
-        <w:rPr>
-          <w:rFonts w:eastAsia="Times New Roman" w:cs="Times New Roman"/>
-          <w:sz w:val="28"/>
-          <w:szCs w:val="28"/>
-          <w:lang w:val="uk-UA"/>
-        </w:rPr>
-        <w:t>виконано завдання;</w:t>
+        <w:t>- виконано завдання;</w:t>
       </w:r>
     </w:p>
     <w:p>
@@ -1324,11 +1208,11 @@
         </w:rPr>
       </w:pPr>
       <w:bookmarkStart w:id="9" w:name="__RefHeading___Toc6872_2826538368"/>
-      <w:bookmarkStart w:id="10" w:name="_Зміст000139"/>
-      <w:bookmarkStart w:id="11" w:name="_Зміст000067"/>
+      <w:bookmarkStart w:id="10" w:name="_Toc196826520"/>
+      <w:bookmarkStart w:id="11" w:name="_Зміст000004"/>
       <w:bookmarkStart w:id="12" w:name="_Зміст000030"/>
-      <w:bookmarkStart w:id="13" w:name="_Зміст000004"/>
-      <w:bookmarkStart w:id="14" w:name="_Toc196826520"/>
+      <w:bookmarkStart w:id="13" w:name="_Зміст000067"/>
+      <w:bookmarkStart w:id="14" w:name="_Зміст000139"/>
       <w:bookmarkEnd w:id="9"/>
       <w:r>
         <w:rPr>
@@ -1611,14 +1495,14 @@
         </w:rPr>
       </w:pPr>
       <w:bookmarkStart w:id="15" w:name="__RefHeading___Toc6874_2826538368"/>
-      <w:bookmarkStart w:id="16" w:name="_Зміст000140"/>
-      <w:bookmarkStart w:id="17" w:name="_Зміст000068"/>
-      <w:bookmarkStart w:id="18" w:name="_Зміст000065"/>
-      <w:bookmarkStart w:id="19" w:name="_Зміст000031"/>
-      <w:bookmarkStart w:id="20" w:name="_Зміст000005"/>
-      <w:bookmarkStart w:id="21" w:name="_Toc196826521"/>
-      <w:bookmarkStart w:id="22" w:name="_Toc27554779"/>
-      <w:bookmarkStart w:id="23" w:name="_Toc533520912"/>
+      <w:bookmarkStart w:id="16" w:name="_Toc533520912"/>
+      <w:bookmarkStart w:id="17" w:name="_Toc27554779"/>
+      <w:bookmarkStart w:id="18" w:name="_Toc196826521"/>
+      <w:bookmarkStart w:id="19" w:name="_Зміст000005"/>
+      <w:bookmarkStart w:id="20" w:name="_Зміст000031"/>
+      <w:bookmarkStart w:id="21" w:name="_Зміст000065"/>
+      <w:bookmarkStart w:id="22" w:name="_Зміст000068"/>
+      <w:bookmarkStart w:id="23" w:name="_Зміст000140"/>
       <w:bookmarkEnd w:id="15"/>
       <w:r>
         <w:rPr>
@@ -1650,19 +1534,19 @@
         </w:tblCellMar>
       </w:tblPr>
       <w:tblGrid>
-        <w:gridCol w:w="1047"/>
-        <w:gridCol w:w="7376"/>
+        <w:gridCol w:w="1046"/>
+        <w:gridCol w:w="7377"/>
       </w:tblGrid>
       <w:tr>
         <w:trPr/>
         <w:tc>
           <w:tcPr>
-            <w:tcW w:w="1047" w:type="dxa"/>
+            <w:tcW w:w="1046" w:type="dxa"/>
             <w:tcBorders/>
           </w:tcPr>
           <w:p>
             <w:pPr>
-              <w:pStyle w:val="Style28"/>
+              <w:pStyle w:val="user4"/>
               <w:spacing w:before="0" w:after="0"/>
               <w:rPr>
                 <w:rFonts w:ascii="Times New Roman" w:hAnsi="Times New Roman"/>
@@ -1684,12 +1568,12 @@
         </w:tc>
         <w:tc>
           <w:tcPr>
-            <w:tcW w:w="7376" w:type="dxa"/>
+            <w:tcW w:w="7377" w:type="dxa"/>
             <w:tcBorders/>
           </w:tcPr>
           <w:p>
             <w:pPr>
-              <w:pStyle w:val="Style28"/>
+              <w:pStyle w:val="user4"/>
               <w:spacing w:before="0" w:after="0"/>
               <w:rPr>
                 <w:rFonts w:ascii="Times New Roman" w:hAnsi="Times New Roman"/>
@@ -1732,12 +1616,12 @@
         <w:trPr/>
         <w:tc>
           <w:tcPr>
-            <w:tcW w:w="1047" w:type="dxa"/>
+            <w:tcW w:w="1046" w:type="dxa"/>
             <w:tcBorders/>
           </w:tcPr>
           <w:p>
             <w:pPr>
-              <w:pStyle w:val="Style28"/>
+              <w:pStyle w:val="user4"/>
               <w:spacing w:before="0" w:after="0"/>
               <w:rPr>
                 <w:rFonts w:ascii="Times New Roman" w:hAnsi="Times New Roman"/>
@@ -1759,12 +1643,12 @@
         </w:tc>
         <w:tc>
           <w:tcPr>
-            <w:tcW w:w="7376" w:type="dxa"/>
+            <w:tcW w:w="7377" w:type="dxa"/>
             <w:tcBorders/>
           </w:tcPr>
           <w:p>
             <w:pPr>
-              <w:pStyle w:val="Style28"/>
+              <w:pStyle w:val="user4"/>
               <w:spacing w:before="0" w:after="0"/>
               <w:rPr>
                 <w:rFonts w:ascii="Times New Roman" w:hAnsi="Times New Roman"/>
@@ -1789,12 +1673,12 @@
         <w:trPr/>
         <w:tc>
           <w:tcPr>
-            <w:tcW w:w="1047" w:type="dxa"/>
+            <w:tcW w:w="1046" w:type="dxa"/>
             <w:tcBorders/>
           </w:tcPr>
           <w:p>
             <w:pPr>
-              <w:pStyle w:val="Style28"/>
+              <w:pStyle w:val="user4"/>
               <w:spacing w:before="0" w:after="0"/>
               <w:rPr>
                 <w:rFonts w:ascii="Times New Roman" w:hAnsi="Times New Roman"/>
@@ -1816,12 +1700,12 @@
         </w:tc>
         <w:tc>
           <w:tcPr>
-            <w:tcW w:w="7376" w:type="dxa"/>
+            <w:tcW w:w="7377" w:type="dxa"/>
             <w:tcBorders/>
           </w:tcPr>
           <w:p>
             <w:pPr>
-              <w:pStyle w:val="Style28"/>
+              <w:pStyle w:val="user4"/>
               <w:spacing w:before="0" w:after="0"/>
               <w:rPr>
                 <w:rFonts w:ascii="Times New Roman" w:hAnsi="Times New Roman"/>
@@ -1853,7 +1737,10 @@
         </w:rPr>
       </w:pPr>
       <w:r>
-        <w:rPr/>
+        <w:rPr>
+          <w:sz w:val="28"/>
+          <w:szCs w:val="28"/>
+        </w:rPr>
       </w:r>
       <w:r>
         <w:br w:type="page"/>
@@ -1870,11 +1757,11 @@
         </w:rPr>
       </w:pPr>
       <w:bookmarkStart w:id="24" w:name="__RefHeading___Toc6878_2826538368"/>
-      <w:bookmarkStart w:id="25" w:name="_Зміст000142"/>
-      <w:bookmarkStart w:id="26" w:name="_Зміст000070"/>
+      <w:bookmarkStart w:id="25" w:name="_Toc533520913"/>
+      <w:bookmarkStart w:id="26" w:name="_Toc27554781"/>
       <w:bookmarkStart w:id="27" w:name="_Toc196826523"/>
-      <w:bookmarkStart w:id="28" w:name="_Toc27554781"/>
-      <w:bookmarkStart w:id="29" w:name="_Toc533520913"/>
+      <w:bookmarkStart w:id="28" w:name="_Зміст000070"/>
+      <w:bookmarkStart w:id="29" w:name="_Зміст000142"/>
       <w:bookmarkEnd w:id="24"/>
       <w:r>
         <w:rPr>
@@ -1896,8 +1783,19 @@
           <w:szCs w:val="28"/>
           <w:lang w:val="uk-UA"/>
         </w:rPr>
-        <w:t>Ознайомлення з м</w:t>
-      </w:r>
+        <w:t>Ознайомлення з місцем проходження практики</w:t>
+      </w:r>
+    </w:p>
+    <w:p>
+      <w:pPr>
+        <w:pStyle w:val="Common"/>
+        <w:rPr>
+          <w:rFonts w:ascii="Times New Roman" w:hAnsi="Times New Roman"/>
+          <w:sz w:val="28"/>
+          <w:szCs w:val="28"/>
+          <w:lang w:val="en-US"/>
+        </w:rPr>
+      </w:pPr>
       <w:r>
         <w:rPr>
           <w:rFonts w:eastAsia="Times New Roman" w:cs="Times New Roman"/>
@@ -1905,16 +1803,16 @@
           <w:szCs w:val="28"/>
           <w:lang w:val="uk-UA"/>
         </w:rPr>
-        <w:t>ісце</w:t>
+        <w:t>Обрано компанію I</w:t>
       </w:r>
       <w:r>
         <w:rPr>
           <w:rFonts w:eastAsia="Times New Roman" w:cs="Times New Roman"/>
           <w:sz w:val="28"/>
           <w:szCs w:val="28"/>
-          <w:lang w:val="uk-UA"/>
-        </w:rPr>
-        <w:t>м</w:t>
+          <w:lang w:val="en-US"/>
+        </w:rPr>
+        <w:t xml:space="preserve">nfocom LTD. </w:t>
       </w:r>
       <w:r>
         <w:rPr>
@@ -1923,17 +1821,26 @@
           <w:szCs w:val="28"/>
           <w:lang w:val="uk-UA"/>
         </w:rPr>
-        <w:t xml:space="preserve"> проходження практики</w:t>
+        <w:t>Вона займається автоматизованими системами управління технологічних процесів, вбудованими системами, системами розподілу електроенергії, та іншим.</w:t>
+      </w:r>
+      <w:r>
+        <w:rPr>
+          <w:rFonts w:eastAsia="Times New Roman" w:cs="Times New Roman"/>
+          <w:sz w:val="28"/>
+          <w:szCs w:val="28"/>
+          <w:lang w:val="en-US"/>
+        </w:rPr>
+        <w:t>[1]</w:t>
       </w:r>
     </w:p>
     <w:p>
       <w:pPr>
         <w:pStyle w:val="Common"/>
         <w:rPr>
-          <w:rFonts w:ascii="Times New Roman" w:hAnsi="Times New Roman"/>
-          <w:sz w:val="28"/>
-          <w:szCs w:val="28"/>
-          <w:lang w:val="en-US"/>
+          <w:rFonts w:ascii="Times New Roman" w:hAnsi="Times New Roman" w:eastAsia="Times New Roman" w:cs="Times New Roman"/>
+          <w:sz w:val="28"/>
+          <w:szCs w:val="28"/>
+          <w:lang w:val="uk-UA"/>
         </w:rPr>
       </w:pPr>
       <w:r>
@@ -1943,8 +1850,19 @@
           <w:szCs w:val="28"/>
           <w:lang w:val="uk-UA"/>
         </w:rPr>
-        <w:t xml:space="preserve">Обрано компанію </w:t>
-      </w:r>
+        <w:t>Компанію обрано через її відомість та наявний договір з університетом.</w:t>
+      </w:r>
+    </w:p>
+    <w:p>
+      <w:pPr>
+        <w:pStyle w:val="Common"/>
+        <w:rPr>
+          <w:rFonts w:ascii="Times New Roman" w:hAnsi="Times New Roman" w:eastAsia="Times New Roman" w:cs="Times New Roman"/>
+          <w:sz w:val="28"/>
+          <w:szCs w:val="28"/>
+          <w:lang w:val="uk-UA"/>
+        </w:rPr>
+      </w:pPr>
       <w:r>
         <w:rPr>
           <w:rFonts w:eastAsia="Times New Roman" w:cs="Times New Roman"/>
@@ -1952,109 +1870,24 @@
           <w:szCs w:val="28"/>
           <w:lang w:val="uk-UA"/>
         </w:rPr>
-        <w:t>I</w:t>
-      </w:r>
+        <w:t>Офіс компанії знаходиться у місті. Він складається з двох будівель.</w:t>
+      </w:r>
+    </w:p>
+    <w:p>
+      <w:pPr>
+        <w:pStyle w:val="Common"/>
+        <w:rPr>
+          <w:rFonts w:ascii="Times New Roman" w:hAnsi="Times New Roman" w:eastAsia="Times New Roman" w:cs="Times New Roman"/>
+          <w:sz w:val="28"/>
+          <w:szCs w:val="28"/>
+          <w:lang w:val="uk-UA"/>
+        </w:rPr>
+      </w:pPr>
       <w:r>
         <w:rPr>
           <w:rFonts w:eastAsia="Times New Roman" w:cs="Times New Roman"/>
           <w:sz w:val="28"/>
           <w:szCs w:val="28"/>
-          <w:lang w:val="en-US"/>
-        </w:rPr>
-        <w:t>nfocom LTD</w:t>
-      </w:r>
-      <w:r>
-        <w:rPr>
-          <w:rFonts w:eastAsia="Times New Roman" w:cs="Times New Roman"/>
-          <w:sz w:val="28"/>
-          <w:szCs w:val="28"/>
-          <w:lang w:val="en-US"/>
-        </w:rPr>
-        <w:t xml:space="preserve">. </w:t>
-      </w:r>
-      <w:r>
-        <w:rPr>
-          <w:rFonts w:eastAsia="Times New Roman" w:cs="Times New Roman"/>
-          <w:sz w:val="28"/>
-          <w:szCs w:val="28"/>
-          <w:lang w:val="uk-UA"/>
-        </w:rPr>
-        <w:t xml:space="preserve">Вона </w:t>
-      </w:r>
-      <w:r>
-        <w:rPr>
-          <w:rFonts w:eastAsia="Times New Roman" w:cs="Times New Roman"/>
-          <w:sz w:val="28"/>
-          <w:szCs w:val="28"/>
-          <w:lang w:val="uk-UA"/>
-        </w:rPr>
-        <w:t>займається автоматизованими системами управління технологічних процесів, вбудованими системами, системами розподілу електроенергії, та іншим.</w:t>
-      </w:r>
-      <w:r>
-        <w:rPr>
-          <w:rFonts w:eastAsia="Times New Roman" w:cs="Times New Roman"/>
-          <w:sz w:val="28"/>
-          <w:szCs w:val="28"/>
-          <w:lang w:val="en-US"/>
-        </w:rPr>
-        <w:t>[1]</w:t>
-      </w:r>
-    </w:p>
-    <w:p>
-      <w:pPr>
-        <w:pStyle w:val="Common"/>
-        <w:rPr>
-          <w:rFonts w:ascii="Times New Roman" w:hAnsi="Times New Roman" w:eastAsia="Times New Roman" w:cs="Times New Roman"/>
-          <w:sz w:val="28"/>
-          <w:szCs w:val="28"/>
-          <w:lang w:val="uk-UA"/>
-        </w:rPr>
-      </w:pPr>
-      <w:r>
-        <w:rPr>
-          <w:rFonts w:eastAsia="Times New Roman" w:cs="Times New Roman"/>
-          <w:sz w:val="28"/>
-          <w:szCs w:val="28"/>
-          <w:lang w:val="uk-UA"/>
-        </w:rPr>
-        <w:t>Компанію обрано через її відомість та наявний договір з університетом.</w:t>
-      </w:r>
-    </w:p>
-    <w:p>
-      <w:pPr>
-        <w:pStyle w:val="Common"/>
-        <w:rPr>
-          <w:rFonts w:ascii="Times New Roman" w:hAnsi="Times New Roman" w:eastAsia="Times New Roman" w:cs="Times New Roman"/>
-          <w:sz w:val="28"/>
-          <w:szCs w:val="28"/>
-          <w:lang w:val="uk-UA"/>
-        </w:rPr>
-      </w:pPr>
-      <w:r>
-        <w:rPr>
-          <w:rFonts w:eastAsia="Times New Roman" w:cs="Times New Roman"/>
-          <w:sz w:val="28"/>
-          <w:szCs w:val="28"/>
-          <w:lang w:val="uk-UA"/>
-        </w:rPr>
-        <w:t>Офіс компанії знаходиться у місті. Він складається з двох будівель.</w:t>
-      </w:r>
-    </w:p>
-    <w:p>
-      <w:pPr>
-        <w:pStyle w:val="Common"/>
-        <w:rPr>
-          <w:rFonts w:ascii="Times New Roman" w:hAnsi="Times New Roman" w:eastAsia="Times New Roman" w:cs="Times New Roman"/>
-          <w:sz w:val="28"/>
-          <w:szCs w:val="28"/>
-          <w:lang w:val="uk-UA"/>
-        </w:rPr>
-      </w:pPr>
-      <w:r>
-        <w:rPr>
-          <w:rFonts w:eastAsia="Times New Roman" w:cs="Times New Roman"/>
-          <w:sz w:val="28"/>
-          <w:szCs w:val="28"/>
           <w:lang w:val="uk-UA"/>
         </w:rPr>
       </w:r>
@@ -2065,6 +1898,7 @@
     <w:p>
       <w:pPr>
         <w:pStyle w:val="Title1st"/>
+        <w:spacing w:before="0" w:after="600"/>
         <w:rPr/>
       </w:pPr>
       <w:bookmarkStart w:id="30" w:name="__RefHeading___Toc16725_2705807760"/>
@@ -2128,6 +1962,7 @@
     <w:p>
       <w:pPr>
         <w:pStyle w:val="Title1st"/>
+        <w:spacing w:before="0" w:after="600"/>
         <w:rPr/>
       </w:pPr>
       <w:bookmarkStart w:id="31" w:name="__RefHeading___Toc16727_2705807760"/>
@@ -2184,6 +2019,7 @@
     <w:p>
       <w:pPr>
         <w:pStyle w:val="Title1st"/>
+        <w:spacing w:before="0" w:after="600"/>
         <w:rPr/>
       </w:pPr>
       <w:bookmarkStart w:id="32" w:name="__RefHeading___Toc16729_2705807760"/>
@@ -2306,6 +2142,7 @@
     <w:p>
       <w:pPr>
         <w:pStyle w:val="Title1st"/>
+        <w:spacing w:before="0" w:after="600"/>
         <w:rPr/>
       </w:pPr>
       <w:bookmarkStart w:id="33" w:name="__RefHeading___Toc16731_2705807760"/>
@@ -2330,6 +2167,7 @@
     <w:p>
       <w:pPr>
         <w:pStyle w:val="Title1st"/>
+        <w:spacing w:before="0" w:after="600"/>
         <w:rPr/>
       </w:pPr>
       <w:bookmarkStart w:id="34" w:name="__RefHeading___Toc16733_2705807760"/>
@@ -2354,6 +2192,7 @@
     <w:p>
       <w:pPr>
         <w:pStyle w:val="Title1st"/>
+        <w:spacing w:before="0" w:after="600"/>
         <w:rPr/>
       </w:pPr>
       <w:bookmarkStart w:id="35" w:name="__RefHeading___Toc16696_2705807760"/>
@@ -3781,13 +3620,13 @@
       <w:u w:val="single" w:color="FFFFFF"/>
     </w:rPr>
   </w:style>
+  <w:style w:type="character" w:styleId="user">
+    <w:name w:val="Посилання покажчика (user)"/>
+    <w:qFormat/>
+    <w:rPr/>
+  </w:style>
   <w:style w:type="character" w:styleId="Style18">
     <w:name w:val="Посилання покажчика"/>
-    <w:qFormat/>
-    <w:rPr/>
-  </w:style>
-  <w:style w:type="character" w:styleId="user">
-    <w:name w:val="Посилання покажчика (user)"/>
     <w:qFormat/>
     <w:rPr/>
   </w:style>
@@ -4087,15 +3926,15 @@
       <w:szCs w:val="16"/>
     </w:rPr>
   </w:style>
+  <w:style w:type="paragraph" w:styleId="user3">
+    <w:name w:val="Верхній і нижній колонтитули (user)"/>
+    <w:basedOn w:val="Normal"/>
+    <w:qFormat/>
+    <w:pPr/>
+    <w:rPr/>
+  </w:style>
   <w:style w:type="paragraph" w:styleId="Style25">
     <w:name w:val="Верхній і нижній колонтитули"/>
-    <w:basedOn w:val="Normal"/>
-    <w:qFormat/>
-    <w:pPr/>
-    <w:rPr/>
-  </w:style>
-  <w:style w:type="paragraph" w:styleId="user3">
-    <w:name w:val="Верхній і нижній колонтитули (user)"/>
     <w:basedOn w:val="Normal"/>
     <w:qFormat/>
     <w:pPr/>
@@ -4431,8 +4270,8 @@
       <w:lang w:val="ru-RU" w:eastAsia="ru-RU" w:bidi="ar-SA"/>
     </w:rPr>
   </w:style>
-  <w:style w:type="paragraph" w:styleId="user4">
-    <w:name w:val="Вміст таблиці (user)"/>
+  <w:style w:type="paragraph" w:styleId="Style28">
+    <w:name w:val="Вміст таблиці"/>
     <w:basedOn w:val="Normal"/>
     <w:qFormat/>
     <w:pPr>
@@ -4518,9 +4357,9 @@
     </w:pPr>
     <w:rPr/>
   </w:style>
-  <w:style w:type="paragraph" w:styleId="user5">
-    <w:name w:val="Заголовок таблиці (user)"/>
-    <w:basedOn w:val="user4"/>
+  <w:style w:type="paragraph" w:styleId="Style29">
+    <w:name w:val="Заголовок таблиці"/>
+    <w:basedOn w:val="Style28"/>
     <w:qFormat/>
     <w:pPr>
       <w:suppressLineNumbers/>
@@ -4531,8 +4370,8 @@
       <w:bCs/>
     </w:rPr>
   </w:style>
-  <w:style w:type="paragraph" w:styleId="Style28">
-    <w:name w:val="Вміст таблиці"/>
+  <w:style w:type="paragraph" w:styleId="user4">
+    <w:name w:val="Вміст таблиці (user)"/>
     <w:basedOn w:val="Normal"/>
     <w:qFormat/>
     <w:pPr>

</xml_diff>

<commit_message>
docs -- D: fix errors for the diploma, fill in the practice documents
</commit_message>
<xml_diff>
--- a/42P Praktyka/Звіт.docx
+++ b/42P Praktyka/Звіт.docx
@@ -1424,6 +1424,447 @@
         </w:p>
         <w:p>
           <w:pPr>
+            <w:pStyle w:val="TOC2"/>
+            <w:tabs>
+              <w:tab w:val="clear" w:pos="709"/>
+              <w:tab w:val="right" w:pos="9353" w:leader="dot"/>
+            </w:tabs>
+            <w:rPr/>
+          </w:pPr>
+          <w:hyperlink w:anchor="__RefHeading___Toc6504_2263296625" w:tooltip="1 Неправильні типи даних координатів">
+            <w:r>
+              <w:rPr>
+                <w:rStyle w:val="Style18"/>
+                <w:webHidden/>
+              </w:rPr>
+              <w:t>1 Неправильні типи даних координатів</w:t>
+              <w:tab/>
+              <w:t>9</w:t>
+            </w:r>
+          </w:hyperlink>
+        </w:p>
+        <w:p>
+          <w:pPr>
+            <w:pStyle w:val="TOC3"/>
+            <w:tabs>
+              <w:tab w:val="clear" w:pos="709"/>
+              <w:tab w:val="right" w:pos="9353" w:leader="dot"/>
+            </w:tabs>
+            <w:rPr/>
+          </w:pPr>
+          <w:hyperlink w:anchor="__RefHeading___Toc6506_2263296625" w:tooltip="Завдання">
+            <w:r>
+              <w:rPr>
+                <w:rStyle w:val="Style18"/>
+                <w:webHidden/>
+              </w:rPr>
+              <w:t>Завдання</w:t>
+              <w:tab/>
+              <w:t>9</w:t>
+            </w:r>
+          </w:hyperlink>
+        </w:p>
+        <w:p>
+          <w:pPr>
+            <w:pStyle w:val="TOC3"/>
+            <w:tabs>
+              <w:tab w:val="clear" w:pos="709"/>
+              <w:tab w:val="right" w:pos="9353" w:leader="dot"/>
+            </w:tabs>
+            <w:rPr/>
+          </w:pPr>
+          <w:hyperlink w:anchor="__RefHeading___Toc6508_2263296625" w:tooltip="Рішення">
+            <w:r>
+              <w:rPr>
+                <w:rStyle w:val="Style18"/>
+                <w:webHidden/>
+              </w:rPr>
+              <w:t>Рішення</w:t>
+              <w:tab/>
+              <w:t>9</w:t>
+            </w:r>
+          </w:hyperlink>
+        </w:p>
+        <w:p>
+          <w:pPr>
+            <w:pStyle w:val="TOC2"/>
+            <w:tabs>
+              <w:tab w:val="clear" w:pos="709"/>
+              <w:tab w:val="right" w:pos="9353" w:leader="dot"/>
+            </w:tabs>
+            <w:rPr/>
+          </w:pPr>
+          <w:hyperlink w:anchor="__RefHeading___Toc6510_2263296625" w:tooltip="2 Виправлення IndexError">
+            <w:r>
+              <w:rPr>
+                <w:rStyle w:val="Style18"/>
+                <w:webHidden/>
+              </w:rPr>
+              <w:t>2 Виправлення IndexError</w:t>
+              <w:tab/>
+              <w:t>9</w:t>
+            </w:r>
+          </w:hyperlink>
+        </w:p>
+        <w:p>
+          <w:pPr>
+            <w:pStyle w:val="TOC3"/>
+            <w:tabs>
+              <w:tab w:val="clear" w:pos="709"/>
+              <w:tab w:val="right" w:pos="9353" w:leader="dot"/>
+            </w:tabs>
+            <w:rPr/>
+          </w:pPr>
+          <w:hyperlink w:anchor="__RefHeading___Toc6512_2263296625" w:tooltip="Завдання">
+            <w:r>
+              <w:rPr>
+                <w:rStyle w:val="Style18"/>
+                <w:webHidden/>
+              </w:rPr>
+              <w:t>Завдання</w:t>
+              <w:tab/>
+              <w:t>9</w:t>
+            </w:r>
+          </w:hyperlink>
+        </w:p>
+        <w:p>
+          <w:pPr>
+            <w:pStyle w:val="TOC3"/>
+            <w:tabs>
+              <w:tab w:val="clear" w:pos="709"/>
+              <w:tab w:val="right" w:pos="9353" w:leader="dot"/>
+            </w:tabs>
+            <w:rPr/>
+          </w:pPr>
+          <w:hyperlink w:anchor="__RefHeading___Toc6514_2263296625" w:tooltip="Рішення">
+            <w:r>
+              <w:rPr>
+                <w:rStyle w:val="Style18"/>
+                <w:webHidden/>
+              </w:rPr>
+              <w:t>Рішення</w:t>
+              <w:tab/>
+              <w:t>9</w:t>
+            </w:r>
+          </w:hyperlink>
+        </w:p>
+        <w:p>
+          <w:pPr>
+            <w:pStyle w:val="TOC2"/>
+            <w:tabs>
+              <w:tab w:val="clear" w:pos="709"/>
+              <w:tab w:val="right" w:pos="9353" w:leader="dot"/>
+            </w:tabs>
+            <w:rPr/>
+          </w:pPr>
+          <w:hyperlink w:anchor="__RefHeading___Toc6709_2263296625" w:tooltip="3 Виправлення обнулення обраної вантажівки після продажу">
+            <w:r>
+              <w:rPr>
+                <w:rStyle w:val="Style18"/>
+                <w:webHidden/>
+              </w:rPr>
+              <w:t>3 Виправлення обнулення обраної вантажівки після продажу</w:t>
+              <w:tab/>
+              <w:t>10</w:t>
+            </w:r>
+          </w:hyperlink>
+        </w:p>
+        <w:p>
+          <w:pPr>
+            <w:pStyle w:val="TOC3"/>
+            <w:tabs>
+              <w:tab w:val="clear" w:pos="709"/>
+              <w:tab w:val="right" w:pos="9353" w:leader="dot"/>
+            </w:tabs>
+            <w:rPr/>
+          </w:pPr>
+          <w:hyperlink w:anchor="__RefHeading___Toc6711_2263296625" w:tooltip="Завдання">
+            <w:r>
+              <w:rPr>
+                <w:rStyle w:val="Style18"/>
+                <w:webHidden/>
+              </w:rPr>
+              <w:t>Завдання</w:t>
+              <w:tab/>
+              <w:t>10</w:t>
+            </w:r>
+          </w:hyperlink>
+        </w:p>
+        <w:p>
+          <w:pPr>
+            <w:pStyle w:val="TOC3"/>
+            <w:tabs>
+              <w:tab w:val="clear" w:pos="709"/>
+              <w:tab w:val="right" w:pos="9353" w:leader="dot"/>
+            </w:tabs>
+            <w:rPr/>
+          </w:pPr>
+          <w:hyperlink w:anchor="__RefHeading___Toc6713_2263296625" w:tooltip="Рішення">
+            <w:r>
+              <w:rPr>
+                <w:rStyle w:val="Style18"/>
+                <w:webHidden/>
+              </w:rPr>
+              <w:t>Рішення</w:t>
+              <w:tab/>
+              <w:t>10</w:t>
+            </w:r>
+          </w:hyperlink>
+        </w:p>
+        <w:p>
+          <w:pPr>
+            <w:pStyle w:val="TOC2"/>
+            <w:tabs>
+              <w:tab w:val="clear" w:pos="709"/>
+              <w:tab w:val="right" w:pos="9353" w:leader="dot"/>
+            </w:tabs>
+            <w:rPr/>
+          </w:pPr>
+          <w:hyperlink w:anchor="__RefHeading___Toc6715_2263296625" w:tooltip="4 Одруківка назви змінної">
+            <w:r>
+              <w:rPr>
+                <w:rStyle w:val="Style18"/>
+                <w:webHidden/>
+              </w:rPr>
+              <w:t>4 Одруківка назви змінної</w:t>
+              <w:tab/>
+              <w:t>10</w:t>
+            </w:r>
+          </w:hyperlink>
+        </w:p>
+        <w:p>
+          <w:pPr>
+            <w:pStyle w:val="TOC3"/>
+            <w:tabs>
+              <w:tab w:val="clear" w:pos="709"/>
+              <w:tab w:val="right" w:pos="9353" w:leader="dot"/>
+            </w:tabs>
+            <w:rPr/>
+          </w:pPr>
+          <w:hyperlink w:anchor="__RefHeading___Toc6717_2263296625" w:tooltip="Завдання">
+            <w:r>
+              <w:rPr>
+                <w:rStyle w:val="Style18"/>
+                <w:webHidden/>
+              </w:rPr>
+              <w:t>Завдання</w:t>
+              <w:tab/>
+              <w:t>10</w:t>
+            </w:r>
+          </w:hyperlink>
+        </w:p>
+        <w:p>
+          <w:pPr>
+            <w:pStyle w:val="TOC3"/>
+            <w:tabs>
+              <w:tab w:val="clear" w:pos="709"/>
+              <w:tab w:val="right" w:pos="9353" w:leader="dot"/>
+            </w:tabs>
+            <w:rPr/>
+          </w:pPr>
+          <w:hyperlink w:anchor="__RefHeading___Toc6719_2263296625" w:tooltip="Рішення">
+            <w:r>
+              <w:rPr>
+                <w:rStyle w:val="Style18"/>
+                <w:webHidden/>
+              </w:rPr>
+              <w:t>Рішення</w:t>
+              <w:tab/>
+              <w:t>11</w:t>
+            </w:r>
+          </w:hyperlink>
+        </w:p>
+        <w:p>
+          <w:pPr>
+            <w:pStyle w:val="TOC2"/>
+            <w:tabs>
+              <w:tab w:val="clear" w:pos="709"/>
+              <w:tab w:val="right" w:pos="9353" w:leader="dot"/>
+            </w:tabs>
+            <w:rPr/>
+          </w:pPr>
+          <w:hyperlink w:anchor="__RefHeading___Toc6721_2263296625" w:tooltip="5 Виведення порожньої сітки при відсутності об’єктів">
+            <w:r>
+              <w:rPr>
+                <w:rStyle w:val="Style18"/>
+                <w:webHidden/>
+              </w:rPr>
+              <w:t>5 Виведення порожньої сітки при відсутності об’єктів</w:t>
+              <w:tab/>
+              <w:t>11</w:t>
+            </w:r>
+          </w:hyperlink>
+        </w:p>
+        <w:p>
+          <w:pPr>
+            <w:pStyle w:val="TOC3"/>
+            <w:tabs>
+              <w:tab w:val="clear" w:pos="709"/>
+              <w:tab w:val="right" w:pos="9353" w:leader="dot"/>
+            </w:tabs>
+            <w:rPr/>
+          </w:pPr>
+          <w:hyperlink w:anchor="__RefHeading___Toc6723_2263296625" w:tooltip="Завдання">
+            <w:r>
+              <w:rPr>
+                <w:rStyle w:val="Style18"/>
+                <w:webHidden/>
+              </w:rPr>
+              <w:t>Завдання</w:t>
+              <w:tab/>
+              <w:t>11</w:t>
+            </w:r>
+          </w:hyperlink>
+        </w:p>
+        <w:p>
+          <w:pPr>
+            <w:pStyle w:val="TOC3"/>
+            <w:tabs>
+              <w:tab w:val="clear" w:pos="709"/>
+              <w:tab w:val="right" w:pos="9353" w:leader="dot"/>
+            </w:tabs>
+            <w:rPr/>
+          </w:pPr>
+          <w:hyperlink w:anchor="__RefHeading___Toc6725_2263296625" w:tooltip="Рішення">
+            <w:r>
+              <w:rPr>
+                <w:rStyle w:val="Style18"/>
+                <w:webHidden/>
+              </w:rPr>
+              <w:t>Рішення</w:t>
+              <w:tab/>
+              <w:t>11</w:t>
+            </w:r>
+          </w:hyperlink>
+        </w:p>
+        <w:p>
+          <w:pPr>
+            <w:pStyle w:val="TOC2"/>
+            <w:tabs>
+              <w:tab w:val="clear" w:pos="709"/>
+              <w:tab w:val="right" w:pos="9353" w:leader="dot"/>
+            </w:tabs>
+            <w:rPr/>
+          </w:pPr>
+          <w:hyperlink w:anchor="__RefHeading___Toc6727_2263296625" w:tooltip="6 Виправлення типу змінної">
+            <w:r>
+              <w:rPr>
+                <w:rStyle w:val="Style18"/>
+                <w:webHidden/>
+              </w:rPr>
+              <w:t>6 Виправлення типу змінної</w:t>
+              <w:tab/>
+              <w:t>12</w:t>
+            </w:r>
+          </w:hyperlink>
+        </w:p>
+        <w:p>
+          <w:pPr>
+            <w:pStyle w:val="TOC3"/>
+            <w:tabs>
+              <w:tab w:val="clear" w:pos="709"/>
+              <w:tab w:val="right" w:pos="9353" w:leader="dot"/>
+            </w:tabs>
+            <w:rPr/>
+          </w:pPr>
+          <w:hyperlink w:anchor="__RefHeading___Toc6729_2263296625" w:tooltip="Завдання">
+            <w:r>
+              <w:rPr>
+                <w:rStyle w:val="Style18"/>
+                <w:webHidden/>
+              </w:rPr>
+              <w:t>Завдання</w:t>
+              <w:tab/>
+              <w:t>12</w:t>
+            </w:r>
+          </w:hyperlink>
+        </w:p>
+        <w:p>
+          <w:pPr>
+            <w:pStyle w:val="TOC3"/>
+            <w:tabs>
+              <w:tab w:val="clear" w:pos="709"/>
+              <w:tab w:val="right" w:pos="9353" w:leader="dot"/>
+            </w:tabs>
+            <w:rPr/>
+          </w:pPr>
+          <w:hyperlink w:anchor="__RefHeading___Toc6731_2263296625" w:tooltip="Рішення">
+            <w:r>
+              <w:rPr>
+                <w:rStyle w:val="Style18"/>
+                <w:webHidden/>
+              </w:rPr>
+              <w:t>Рішення</w:t>
+              <w:tab/>
+              <w:t>12</w:t>
+            </w:r>
+          </w:hyperlink>
+        </w:p>
+        <w:p>
+          <w:pPr>
+            <w:pStyle w:val="TOC2"/>
+            <w:tabs>
+              <w:tab w:val="clear" w:pos="709"/>
+              <w:tab w:val="right" w:pos="9353" w:leader="dot"/>
+            </w:tabs>
+            <w:rPr/>
+          </w:pPr>
+          <w:hyperlink w:anchor="__RefHeading___Toc6733_2263296625" w:tooltip="7 Додавання обробників помилок до запитів бази даних">
+            <w:r>
+              <w:rPr>
+                <w:rStyle w:val="Style18"/>
+                <w:webHidden/>
+              </w:rPr>
+              <w:t>7 Додавання обробників помилок до запитів бази даних</w:t>
+              <w:tab/>
+              <w:t>12</w:t>
+            </w:r>
+          </w:hyperlink>
+        </w:p>
+        <w:p>
+          <w:pPr>
+            <w:pStyle w:val="TOC3"/>
+            <w:tabs>
+              <w:tab w:val="clear" w:pos="709"/>
+              <w:tab w:val="right" w:pos="9353" w:leader="dot"/>
+            </w:tabs>
+            <w:rPr/>
+          </w:pPr>
+          <w:hyperlink w:anchor="__RefHeading___Toc6735_2263296625" w:tooltip="Завдання">
+            <w:r>
+              <w:rPr>
+                <w:rStyle w:val="Style18"/>
+                <w:webHidden/>
+              </w:rPr>
+              <w:t>Завдання</w:t>
+              <w:tab/>
+              <w:t>12</w:t>
+            </w:r>
+          </w:hyperlink>
+        </w:p>
+        <w:p>
+          <w:pPr>
+            <w:pStyle w:val="TOC3"/>
+            <w:tabs>
+              <w:tab w:val="clear" w:pos="709"/>
+              <w:tab w:val="right" w:pos="9353" w:leader="dot"/>
+            </w:tabs>
+            <w:rPr/>
+          </w:pPr>
+          <w:hyperlink w:anchor="__RefHeading___Toc6737_2263296625" w:tooltip="Рішення">
+            <w:r>
+              <w:rPr>
+                <w:rStyle w:val="Style18"/>
+                <w:webHidden/>
+              </w:rPr>
+              <w:t>Рішення</w:t>
+              <w:tab/>
+              <w:t>12</w:t>
+            </w:r>
+          </w:hyperlink>
+        </w:p>
+        <w:p>
+          <w:pPr>
             <w:pStyle w:val="TOC1"/>
             <w:tabs>
               <w:tab w:val="clear" w:pos="9344"/>
@@ -1439,7 +1880,7 @@
               </w:rPr>
               <w:t>6 Прийняття роботи</w:t>
               <w:tab/>
-              <w:t>10</w:t>
+              <w:t>14</w:t>
             </w:r>
           </w:hyperlink>
         </w:p>
@@ -1460,7 +1901,7 @@
               </w:rPr>
               <w:t>Список використаних джерел</w:t>
               <w:tab/>
-              <w:t>11</w:t>
+              <w:t>15</w:t>
             </w:r>
           </w:hyperlink>
           <w:r>
@@ -1546,7 +1987,7 @@
           </w:tcPr>
           <w:p>
             <w:pPr>
-              <w:pStyle w:val="user4"/>
+              <w:pStyle w:val="user5"/>
               <w:spacing w:before="0" w:after="0"/>
               <w:rPr>
                 <w:rFonts w:ascii="Times New Roman" w:hAnsi="Times New Roman"/>
@@ -1573,7 +2014,7 @@
           </w:tcPr>
           <w:p>
             <w:pPr>
-              <w:pStyle w:val="user4"/>
+              <w:pStyle w:val="user5"/>
               <w:spacing w:before="0" w:after="0"/>
               <w:rPr>
                 <w:rFonts w:ascii="Times New Roman" w:hAnsi="Times New Roman"/>
@@ -1621,7 +2062,7 @@
           </w:tcPr>
           <w:p>
             <w:pPr>
-              <w:pStyle w:val="user4"/>
+              <w:pStyle w:val="user5"/>
               <w:spacing w:before="0" w:after="0"/>
               <w:rPr>
                 <w:rFonts w:ascii="Times New Roman" w:hAnsi="Times New Roman"/>
@@ -1648,7 +2089,7 @@
           </w:tcPr>
           <w:p>
             <w:pPr>
-              <w:pStyle w:val="user4"/>
+              <w:pStyle w:val="user5"/>
               <w:spacing w:before="0" w:after="0"/>
               <w:rPr>
                 <w:rFonts w:ascii="Times New Roman" w:hAnsi="Times New Roman"/>
@@ -1678,7 +2119,7 @@
           </w:tcPr>
           <w:p>
             <w:pPr>
-              <w:pStyle w:val="user4"/>
+              <w:pStyle w:val="user5"/>
               <w:spacing w:before="0" w:after="0"/>
               <w:rPr>
                 <w:rFonts w:ascii="Times New Roman" w:hAnsi="Times New Roman"/>
@@ -1705,7 +2146,7 @@
           </w:tcPr>
           <w:p>
             <w:pPr>
-              <w:pStyle w:val="user4"/>
+              <w:pStyle w:val="user5"/>
               <w:spacing w:before="0" w:after="0"/>
               <w:rPr>
                 <w:rFonts w:ascii="Times New Roman" w:hAnsi="Times New Roman"/>
@@ -2154,11 +2595,1702 @@
     </w:p>
     <w:p>
       <w:pPr>
-        <w:pStyle w:val="Common"/>
-        <w:rPr/>
-      </w:pPr>
-      <w:r>
-        <w:rPr/>
+        <w:pStyle w:val="Title2nd1"/>
+        <w:rPr/>
+      </w:pPr>
+      <w:bookmarkStart w:id="34" w:name="__RefHeading___Toc6504_2263296625"/>
+      <w:bookmarkEnd w:id="34"/>
+      <w:r>
+        <w:rPr/>
+        <w:t>1 Неправильні типи даних координатів</w:t>
+      </w:r>
+    </w:p>
+    <w:p>
+      <w:pPr>
+        <w:pStyle w:val="Title3rd1"/>
+        <w:rPr/>
+      </w:pPr>
+      <w:bookmarkStart w:id="35" w:name="__RefHeading___Toc6506_2263296625"/>
+      <w:bookmarkEnd w:id="35"/>
+      <w:r>
+        <w:rPr/>
+        <w:t>Завдання</w:t>
+      </w:r>
+    </w:p>
+    <w:p>
+      <w:pPr>
+        <w:pStyle w:val="Common"/>
+        <w:rPr/>
+      </w:pPr>
+      <w:r>
+        <w:rPr/>
+      </w:r>
+    </w:p>
+    <w:p>
+      <w:pPr>
+        <w:pStyle w:val="Common"/>
+        <w:rPr/>
+      </w:pPr>
+      <w:r>
+        <w:rPr/>
+        <w:t>data.py:112 — coordinates=row.coordinates.split(",") повертає list[str], але IOrder і Leaflet очікують tuple[float, float]. Виклики ui.leaflet(center=...) та map.set_center(...) працюватимуть некоректно.</w:t>
+      </w:r>
+    </w:p>
+    <w:p>
+      <w:pPr>
+        <w:pStyle w:val="Common"/>
+        <w:rPr/>
+      </w:pPr>
+      <w:r>
+        <w:rPr/>
+      </w:r>
+    </w:p>
+    <w:p>
+      <w:pPr>
+        <w:pStyle w:val="Title3rd1"/>
+        <w:rPr/>
+      </w:pPr>
+      <w:bookmarkStart w:id="36" w:name="__RefHeading___Toc6508_2263296625"/>
+      <w:bookmarkEnd w:id="36"/>
+      <w:r>
+        <w:rPr/>
+        <w:t>Рішення</w:t>
+      </w:r>
+    </w:p>
+    <w:p>
+      <w:pPr>
+        <w:pStyle w:val="Common"/>
+        <w:rPr/>
+      </w:pPr>
+      <w:r>
+        <w:rPr/>
+      </w:r>
+    </w:p>
+    <w:p>
+      <w:pPr>
+        <w:pStyle w:val="Common"/>
+        <w:rPr>
+          <w:lang w:val="uk-UA"/>
+        </w:rPr>
+      </w:pPr>
+      <w:r>
+        <w:rPr>
+          <w:lang w:val="uk-UA"/>
+        </w:rPr>
+        <w:t xml:space="preserve">У функції </w:t>
+      </w:r>
+      <w:r>
+        <w:rPr>
+          <w:lang w:val="en-US"/>
+        </w:rPr>
+        <w:t xml:space="preserve">load_orders </w:t>
+      </w:r>
+      <w:r>
+        <w:rPr>
+          <w:lang w:val="uk-UA"/>
+        </w:rPr>
+        <w:t xml:space="preserve">у файлі </w:t>
+      </w:r>
+      <w:r>
+        <w:rPr>
+          <w:lang w:val="en-US"/>
+        </w:rPr>
+        <w:t xml:space="preserve">data.py </w:t>
+      </w:r>
+      <w:r>
+        <w:rPr>
+          <w:lang w:val="uk-UA"/>
+        </w:rPr>
+        <w:t>змінено рядок:</w:t>
+      </w:r>
+    </w:p>
+    <w:p>
+      <w:pPr>
+        <w:pStyle w:val="Common"/>
+        <w:rPr>
+          <w:lang w:val="uk-UA"/>
+        </w:rPr>
+      </w:pPr>
+      <w:r>
+        <w:rPr>
+          <w:lang w:val="uk-UA"/>
+        </w:rPr>
+      </w:r>
+    </w:p>
+    <w:p>
+      <w:pPr>
+        <w:pStyle w:val="Code"/>
+        <w:rPr/>
+      </w:pPr>
+      <w:r>
+        <w:rPr/>
+        <w:t>coordinates=row.coordinates.split(","),</w:t>
+      </w:r>
+    </w:p>
+    <w:p>
+      <w:pPr>
+        <w:pStyle w:val="Common"/>
+        <w:rPr/>
+      </w:pPr>
+      <w:r>
+        <w:rPr/>
+      </w:r>
+    </w:p>
+    <w:p>
+      <w:pPr>
+        <w:pStyle w:val="Common"/>
+        <w:rPr>
+          <w:lang w:val="uk-UA"/>
+        </w:rPr>
+      </w:pPr>
+      <w:r>
+        <w:rPr>
+          <w:lang w:val="uk-UA"/>
+        </w:rPr>
+        <w:t>На наступний:</w:t>
+      </w:r>
+    </w:p>
+    <w:p>
+      <w:pPr>
+        <w:pStyle w:val="Common"/>
+        <w:rPr/>
+      </w:pPr>
+      <w:r>
+        <w:rPr/>
+      </w:r>
+    </w:p>
+    <w:p>
+      <w:pPr>
+        <w:pStyle w:val="Code"/>
+        <w:rPr/>
+      </w:pPr>
+      <w:r>
+        <w:rPr/>
+        <w:t>coordinates=tuple(</w:t>
+      </w:r>
+    </w:p>
+    <w:p>
+      <w:pPr>
+        <w:pStyle w:val="Code"/>
+        <w:rPr/>
+      </w:pPr>
+      <w:r>
+        <w:rPr/>
+        <w:tab/>
+        <w:t>float(coordinate) for coordinate in row.coordinates.split(",")</w:t>
+      </w:r>
+    </w:p>
+    <w:p>
+      <w:pPr>
+        <w:pStyle w:val="Code"/>
+        <w:rPr/>
+      </w:pPr>
+      <w:r>
+        <w:rPr/>
+        <w:t>),</w:t>
+      </w:r>
+    </w:p>
+    <w:p>
+      <w:pPr>
+        <w:pStyle w:val="Common"/>
+        <w:rPr/>
+      </w:pPr>
+      <w:r>
+        <w:rPr/>
+      </w:r>
+    </w:p>
+    <w:p>
+      <w:pPr>
+        <w:pStyle w:val="Title2nd1"/>
+        <w:rPr/>
+      </w:pPr>
+      <w:bookmarkStart w:id="37" w:name="__RefHeading___Toc6510_2263296625"/>
+      <w:bookmarkEnd w:id="37"/>
+      <w:r>
+        <w:rPr/>
+        <w:t xml:space="preserve">2 Виправлення </w:t>
+      </w:r>
+      <w:r>
+        <w:rPr>
+          <w:lang w:val="en-US"/>
+        </w:rPr>
+        <w:t>IndexError</w:t>
+      </w:r>
+    </w:p>
+    <w:p>
+      <w:pPr>
+        <w:pStyle w:val="Title3rd1"/>
+        <w:rPr/>
+      </w:pPr>
+      <w:bookmarkStart w:id="38" w:name="__RefHeading___Toc6512_2263296625"/>
+      <w:bookmarkEnd w:id="38"/>
+      <w:r>
+        <w:rPr/>
+        <w:t>Завдання</w:t>
+      </w:r>
+    </w:p>
+    <w:p>
+      <w:pPr>
+        <w:pStyle w:val="Common"/>
+        <w:rPr>
+          <w:lang w:val="uk-UA"/>
+        </w:rPr>
+      </w:pPr>
+      <w:r>
+        <w:rPr>
+          <w:lang w:val="uk-UA"/>
+        </w:rPr>
+      </w:r>
+    </w:p>
+    <w:p>
+      <w:pPr>
+        <w:pStyle w:val="Common"/>
+        <w:rPr>
+          <w:lang w:val="uk-UA"/>
+        </w:rPr>
+      </w:pPr>
+      <w:r>
+        <w:rPr>
+          <w:lang w:val="uk-UA"/>
+        </w:rPr>
+        <w:t>main.py:294 — State.orders[0].coordinates викличе IndexError, якщо в базі немає жодного замовлення.</w:t>
+      </w:r>
+    </w:p>
+    <w:p>
+      <w:pPr>
+        <w:pStyle w:val="Common"/>
+        <w:rPr>
+          <w:lang w:val="uk-UA"/>
+        </w:rPr>
+      </w:pPr>
+      <w:r>
+        <w:rPr>
+          <w:lang w:val="uk-UA"/>
+        </w:rPr>
+      </w:r>
+    </w:p>
+    <w:p>
+      <w:pPr>
+        <w:pStyle w:val="Title3rd1"/>
+        <w:rPr>
+          <w:lang w:val="uk-UA"/>
+        </w:rPr>
+      </w:pPr>
+      <w:bookmarkStart w:id="39" w:name="__RefHeading___Toc6514_2263296625"/>
+      <w:bookmarkEnd w:id="39"/>
+      <w:r>
+        <w:rPr>
+          <w:lang w:val="uk-UA"/>
+        </w:rPr>
+        <w:t>Рішення</w:t>
+      </w:r>
+    </w:p>
+    <w:p>
+      <w:pPr>
+        <w:pStyle w:val="Common"/>
+        <w:rPr/>
+      </w:pPr>
+      <w:r>
+        <w:rPr/>
+      </w:r>
+    </w:p>
+    <w:p>
+      <w:pPr>
+        <w:pStyle w:val="Common"/>
+        <w:rPr>
+          <w:lang w:val="uk-UA"/>
+        </w:rPr>
+      </w:pPr>
+      <w:r>
+        <w:rPr>
+          <w:lang w:val="uk-UA"/>
+        </w:rPr>
+        <w:t xml:space="preserve">У функції </w:t>
+      </w:r>
+      <w:r>
+        <w:rPr>
+          <w:lang w:val="en-US"/>
+        </w:rPr>
+        <w:t xml:space="preserve">orders_view </w:t>
+      </w:r>
+      <w:r>
+        <w:rPr>
+          <w:lang w:val="uk-UA"/>
+        </w:rPr>
+        <w:t>замінити рядок:</w:t>
+      </w:r>
+    </w:p>
+    <w:p>
+      <w:pPr>
+        <w:pStyle w:val="Common"/>
+        <w:rPr>
+          <w:lang w:val="uk-UA"/>
+        </w:rPr>
+      </w:pPr>
+      <w:r>
+        <w:rPr>
+          <w:lang w:val="uk-UA"/>
+        </w:rPr>
+      </w:r>
+    </w:p>
+    <w:p>
+      <w:pPr>
+        <w:pStyle w:val="Code"/>
+        <w:rPr/>
+      </w:pPr>
+      <w:r>
+        <w:rPr/>
+        <w:t>map = ui.leaflet(center=State.orders[0].coordinates, zoom=10)</w:t>
+      </w:r>
+    </w:p>
+    <w:p>
+      <w:pPr>
+        <w:pStyle w:val="Common"/>
+        <w:rPr>
+          <w:lang w:val="uk-UA"/>
+        </w:rPr>
+      </w:pPr>
+      <w:r>
+        <w:rPr>
+          <w:lang w:val="uk-UA"/>
+        </w:rPr>
+      </w:r>
+    </w:p>
+    <w:p>
+      <w:pPr>
+        <w:pStyle w:val="Common"/>
+        <w:rPr>
+          <w:lang w:val="uk-UA"/>
+        </w:rPr>
+      </w:pPr>
+      <w:r>
+        <w:rPr>
+          <w:lang w:val="uk-UA"/>
+        </w:rPr>
+        <w:t>На наступні:</w:t>
+      </w:r>
+    </w:p>
+    <w:p>
+      <w:pPr>
+        <w:pStyle w:val="Common"/>
+        <w:rPr>
+          <w:lang w:val="uk-UA"/>
+        </w:rPr>
+      </w:pPr>
+      <w:r>
+        <w:rPr>
+          <w:lang w:val="uk-UA"/>
+        </w:rPr>
+      </w:r>
+    </w:p>
+    <w:p>
+      <w:pPr>
+        <w:pStyle w:val="Code"/>
+        <w:rPr/>
+      </w:pPr>
+      <w:r>
+        <w:rPr/>
+        <w:t>try:</w:t>
+      </w:r>
+    </w:p>
+    <w:p>
+      <w:pPr>
+        <w:pStyle w:val="Code"/>
+        <w:rPr/>
+      </w:pPr>
+      <w:r>
+        <w:rPr/>
+        <w:tab/>
+        <w:t>map = ui.leaflet(center=State.orders[0].coordinates, zoom=10)</w:t>
+      </w:r>
+    </w:p>
+    <w:p>
+      <w:pPr>
+        <w:pStyle w:val="Code"/>
+        <w:rPr/>
+      </w:pPr>
+      <w:r>
+        <w:rPr/>
+        <w:t>except IndexError:</w:t>
+      </w:r>
+    </w:p>
+    <w:p>
+      <w:pPr>
+        <w:pStyle w:val="Code"/>
+        <w:rPr/>
+      </w:pPr>
+      <w:r>
+        <w:rPr/>
+        <w:tab/>
+        <w:t>map = ui.leaflet(center=(47.839790847405894, 35.13965215348557), zoom=10)</w:t>
+      </w:r>
+    </w:p>
+    <w:p>
+      <w:pPr>
+        <w:pStyle w:val="Common"/>
+        <w:rPr>
+          <w:lang w:val="uk-UA"/>
+        </w:rPr>
+      </w:pPr>
+      <w:r>
+        <w:rPr>
+          <w:lang w:val="uk-UA"/>
+        </w:rPr>
+      </w:r>
+    </w:p>
+    <w:p>
+      <w:pPr>
+        <w:pStyle w:val="Common"/>
+        <w:rPr>
+          <w:lang w:val="uk-UA"/>
+        </w:rPr>
+      </w:pPr>
+      <w:r>
+        <w:rPr>
+          <w:lang w:val="uk-UA"/>
+        </w:rPr>
+        <w:t>Тут в разі помилки на мапі встановлюється локація міста Запоріжжя.</w:t>
+      </w:r>
+    </w:p>
+    <w:p>
+      <w:pPr>
+        <w:pStyle w:val="Common"/>
+        <w:rPr>
+          <w:lang w:val="uk-UA"/>
+        </w:rPr>
+      </w:pPr>
+      <w:r>
+        <w:rPr>
+          <w:lang w:val="uk-UA"/>
+        </w:rPr>
+      </w:r>
+    </w:p>
+    <w:p>
+      <w:pPr>
+        <w:pStyle w:val="Title2nd1"/>
+        <w:rPr/>
+      </w:pPr>
+      <w:bookmarkStart w:id="40" w:name="__RefHeading___Toc6709_2263296625"/>
+      <w:bookmarkEnd w:id="40"/>
+      <w:r>
+        <w:rPr/>
+        <w:t>3 Виправлення обнулення обраної вантажівки після продажу</w:t>
+      </w:r>
+    </w:p>
+    <w:p>
+      <w:pPr>
+        <w:pStyle w:val="Title3rd1"/>
+        <w:rPr/>
+      </w:pPr>
+      <w:bookmarkStart w:id="41" w:name="__RefHeading___Toc6711_2263296625"/>
+      <w:bookmarkEnd w:id="41"/>
+      <w:r>
+        <w:rPr/>
+        <w:t>Завдання</w:t>
+      </w:r>
+    </w:p>
+    <w:p>
+      <w:pPr>
+        <w:pStyle w:val="Common"/>
+        <w:rPr/>
+      </w:pPr>
+      <w:r>
+        <w:rPr/>
+      </w:r>
+    </w:p>
+    <w:p>
+      <w:pPr>
+        <w:pStyle w:val="Common"/>
+        <w:rPr/>
+      </w:pPr>
+      <w:r>
+        <w:rPr/>
+        <w:t>main.py:128-141 (sell_truck) — безумовно обнуляє State.selected_truck, навіть якщо продана вантажівка не була обраною.</w:t>
+      </w:r>
+    </w:p>
+    <w:p>
+      <w:pPr>
+        <w:pStyle w:val="Common"/>
+        <w:rPr/>
+      </w:pPr>
+      <w:r>
+        <w:rPr/>
+      </w:r>
+    </w:p>
+    <w:p>
+      <w:pPr>
+        <w:pStyle w:val="Title3rd1"/>
+        <w:rPr/>
+      </w:pPr>
+      <w:bookmarkStart w:id="42" w:name="__RefHeading___Toc6713_2263296625"/>
+      <w:bookmarkEnd w:id="42"/>
+      <w:r>
+        <w:rPr/>
+        <w:t>Рішення</w:t>
+      </w:r>
+    </w:p>
+    <w:p>
+      <w:pPr>
+        <w:pStyle w:val="Common"/>
+        <w:rPr/>
+      </w:pPr>
+      <w:r>
+        <w:rPr/>
+      </w:r>
+    </w:p>
+    <w:p>
+      <w:pPr>
+        <w:pStyle w:val="Common"/>
+        <w:rPr>
+          <w:lang w:val="uk-UA"/>
+        </w:rPr>
+      </w:pPr>
+      <w:r>
+        <w:rPr>
+          <w:lang w:val="uk-UA"/>
+        </w:rPr>
+        <w:t>Замінити наступний рядок:</w:t>
+      </w:r>
+    </w:p>
+    <w:p>
+      <w:pPr>
+        <w:pStyle w:val="Common"/>
+        <w:rPr>
+          <w:lang w:val="uk-UA"/>
+        </w:rPr>
+      </w:pPr>
+      <w:r>
+        <w:rPr>
+          <w:lang w:val="uk-UA"/>
+        </w:rPr>
+      </w:r>
+    </w:p>
+    <w:p>
+      <w:pPr>
+        <w:pStyle w:val="Code"/>
+        <w:rPr/>
+      </w:pPr>
+      <w:r>
+        <w:rPr/>
+        <w:t>State.selected_truck = None</w:t>
+      </w:r>
+    </w:p>
+    <w:p>
+      <w:pPr>
+        <w:pStyle w:val="Common"/>
+        <w:rPr>
+          <w:lang w:val="en-US"/>
+        </w:rPr>
+      </w:pPr>
+      <w:r>
+        <w:rPr>
+          <w:lang w:val="en-US"/>
+        </w:rPr>
+      </w:r>
+    </w:p>
+    <w:p>
+      <w:pPr>
+        <w:pStyle w:val="Common"/>
+        <w:rPr>
+          <w:lang w:val="uk-UA"/>
+        </w:rPr>
+      </w:pPr>
+      <w:r>
+        <w:rPr>
+          <w:lang w:val="uk-UA"/>
+        </w:rPr>
+        <w:t>На такі:</w:t>
+      </w:r>
+    </w:p>
+    <w:p>
+      <w:pPr>
+        <w:pStyle w:val="Common"/>
+        <w:rPr>
+          <w:lang w:val="uk-UA"/>
+        </w:rPr>
+      </w:pPr>
+      <w:r>
+        <w:rPr>
+          <w:lang w:val="uk-UA"/>
+        </w:rPr>
+      </w:r>
+    </w:p>
+    <w:p>
+      <w:pPr>
+        <w:pStyle w:val="Code"/>
+        <w:rPr/>
+      </w:pPr>
+      <w:r>
+        <w:rPr/>
+        <w:t>if State.selected_truck == truck:</w:t>
+      </w:r>
+    </w:p>
+    <w:p>
+      <w:pPr>
+        <w:pStyle w:val="Code"/>
+        <w:rPr/>
+      </w:pPr>
+      <w:r>
+        <w:rPr/>
+        <w:tab/>
+        <w:t>State.selected_truck = None</w:t>
+      </w:r>
+    </w:p>
+    <w:p>
+      <w:pPr>
+        <w:pStyle w:val="Common"/>
+        <w:rPr>
+          <w:lang w:val="uk-UA"/>
+        </w:rPr>
+      </w:pPr>
+      <w:r>
+        <w:rPr>
+          <w:lang w:val="uk-UA"/>
+        </w:rPr>
+      </w:r>
+    </w:p>
+    <w:p>
+      <w:pPr>
+        <w:pStyle w:val="Common"/>
+        <w:rPr>
+          <w:lang w:val="uk-UA"/>
+        </w:rPr>
+      </w:pPr>
+      <w:r>
+        <w:rPr>
+          <w:lang w:val="uk-UA"/>
+        </w:rPr>
+        <w:t>Тут здійснюється перевірка чи є обраною надана вантажівка, якщо так, то обрана встановлюється у значення нуль.</w:t>
+      </w:r>
+    </w:p>
+    <w:p>
+      <w:pPr>
+        <w:pStyle w:val="Common"/>
+        <w:rPr>
+          <w:lang w:val="uk-UA"/>
+        </w:rPr>
+      </w:pPr>
+      <w:r>
+        <w:rPr>
+          <w:lang w:val="uk-UA"/>
+        </w:rPr>
+      </w:r>
+    </w:p>
+    <w:p>
+      <w:pPr>
+        <w:pStyle w:val="Title2nd1"/>
+        <w:rPr/>
+      </w:pPr>
+      <w:bookmarkStart w:id="43" w:name="__RefHeading___Toc6715_2263296625"/>
+      <w:bookmarkEnd w:id="43"/>
+      <w:r>
+        <w:rPr/>
+        <w:t>4 Одруківка назви змінної</w:t>
+      </w:r>
+    </w:p>
+    <w:p>
+      <w:pPr>
+        <w:pStyle w:val="Title3rd1"/>
+        <w:rPr/>
+      </w:pPr>
+      <w:bookmarkStart w:id="44" w:name="__RefHeading___Toc6717_2263296625"/>
+      <w:bookmarkEnd w:id="44"/>
+      <w:r>
+        <w:rPr/>
+        <w:t>Завдання</w:t>
+      </w:r>
+    </w:p>
+    <w:p>
+      <w:pPr>
+        <w:pStyle w:val="Common"/>
+        <w:rPr/>
+      </w:pPr>
+      <w:r>
+        <w:rPr/>
+      </w:r>
+    </w:p>
+    <w:p>
+      <w:pPr>
+        <w:pStyle w:val="Common"/>
+        <w:rPr/>
+      </w:pPr>
+      <w:r>
+        <w:rPr/>
+        <w:t>data.py:15 — друкарська помилка OFFORAD (має бути OFFROAD).</w:t>
+      </w:r>
+    </w:p>
+    <w:p>
+      <w:pPr>
+        <w:pStyle w:val="Common"/>
+        <w:rPr/>
+      </w:pPr>
+      <w:r>
+        <w:rPr/>
+      </w:r>
+    </w:p>
+    <w:p>
+      <w:pPr>
+        <w:pStyle w:val="Title3rd1"/>
+        <w:rPr/>
+      </w:pPr>
+      <w:bookmarkStart w:id="45" w:name="__RefHeading___Toc6719_2263296625"/>
+      <w:bookmarkEnd w:id="45"/>
+      <w:r>
+        <w:rPr/>
+        <w:t>Рішенн</w:t>
+      </w:r>
+      <w:r>
+        <w:rPr>
+          <w:lang w:val="uk-UA"/>
+        </w:rPr>
+        <w:t>я</w:t>
+      </w:r>
+    </w:p>
+    <w:p>
+      <w:pPr>
+        <w:pStyle w:val="Common"/>
+        <w:rPr/>
+      </w:pPr>
+      <w:r>
+        <w:rPr/>
+      </w:r>
+    </w:p>
+    <w:p>
+      <w:pPr>
+        <w:pStyle w:val="Common"/>
+        <w:rPr>
+          <w:lang w:val="uk-UA"/>
+        </w:rPr>
+      </w:pPr>
+      <w:r>
+        <w:rPr>
+          <w:lang w:val="uk-UA"/>
+        </w:rPr>
+        <w:t>Замінити рядок:</w:t>
+      </w:r>
+    </w:p>
+    <w:p>
+      <w:pPr>
+        <w:pStyle w:val="Common"/>
+        <w:rPr>
+          <w:lang w:val="uk-UA"/>
+        </w:rPr>
+      </w:pPr>
+      <w:r>
+        <w:rPr>
+          <w:lang w:val="uk-UA"/>
+        </w:rPr>
+      </w:r>
+    </w:p>
+    <w:p>
+      <w:pPr>
+        <w:pStyle w:val="Code"/>
+        <w:rPr/>
+      </w:pPr>
+      <w:r>
+        <w:rPr/>
+        <w:t>OFFORAD = "Всюдихід"</w:t>
+      </w:r>
+    </w:p>
+    <w:p>
+      <w:pPr>
+        <w:pStyle w:val="Common"/>
+        <w:rPr>
+          <w:lang w:val="uk-UA"/>
+        </w:rPr>
+      </w:pPr>
+      <w:r>
+        <w:rPr>
+          <w:lang w:val="uk-UA"/>
+        </w:rPr>
+      </w:r>
+    </w:p>
+    <w:p>
+      <w:pPr>
+        <w:pStyle w:val="Common"/>
+        <w:rPr>
+          <w:lang w:val="uk-UA"/>
+        </w:rPr>
+      </w:pPr>
+      <w:r>
+        <w:rPr>
+          <w:lang w:val="uk-UA"/>
+        </w:rPr>
+        <w:t>На наступний:</w:t>
+      </w:r>
+    </w:p>
+    <w:p>
+      <w:pPr>
+        <w:pStyle w:val="Common"/>
+        <w:rPr>
+          <w:lang w:val="uk-UA"/>
+        </w:rPr>
+      </w:pPr>
+      <w:r>
+        <w:rPr>
+          <w:lang w:val="uk-UA"/>
+        </w:rPr>
+      </w:r>
+    </w:p>
+    <w:p>
+      <w:pPr>
+        <w:pStyle w:val="Code"/>
+        <w:rPr/>
+      </w:pPr>
+      <w:r>
+        <w:rPr/>
+        <w:t>OFFROAD = "Всюдихід"</w:t>
+      </w:r>
+    </w:p>
+    <w:p>
+      <w:pPr>
+        <w:pStyle w:val="Common"/>
+        <w:rPr>
+          <w:lang w:val="uk-UA"/>
+        </w:rPr>
+      </w:pPr>
+      <w:r>
+        <w:rPr>
+          <w:lang w:val="uk-UA"/>
+        </w:rPr>
+      </w:r>
+    </w:p>
+    <w:p>
+      <w:pPr>
+        <w:pStyle w:val="Title2nd1"/>
+        <w:rPr/>
+      </w:pPr>
+      <w:bookmarkStart w:id="46" w:name="__RefHeading___Toc6721_2263296625"/>
+      <w:bookmarkEnd w:id="46"/>
+      <w:r>
+        <w:rPr/>
+        <w:t>5 Виведення порожньої сітки при відсутності об’єктів</w:t>
+      </w:r>
+    </w:p>
+    <w:p>
+      <w:pPr>
+        <w:pStyle w:val="Title3rd1"/>
+        <w:rPr/>
+      </w:pPr>
+      <w:bookmarkStart w:id="47" w:name="__RefHeading___Toc6723_2263296625"/>
+      <w:bookmarkEnd w:id="47"/>
+      <w:r>
+        <w:rPr/>
+        <w:t>Завдання</w:t>
+      </w:r>
+    </w:p>
+    <w:p>
+      <w:pPr>
+        <w:pStyle w:val="Common"/>
+        <w:rPr>
+          <w:lang w:val="uk-UA"/>
+        </w:rPr>
+      </w:pPr>
+      <w:r>
+        <w:rPr>
+          <w:lang w:val="uk-UA"/>
+        </w:rPr>
+      </w:r>
+    </w:p>
+    <w:p>
+      <w:pPr>
+        <w:pStyle w:val="Common"/>
+        <w:rPr>
+          <w:lang w:val="uk-UA"/>
+        </w:rPr>
+      </w:pPr>
+      <w:r>
+        <w:rPr>
+          <w:lang w:val="uk-UA"/>
+        </w:rPr>
+        <w:t>main.py:183-188` — loans_view малює пустий ui.grid навіть коли вже показано напис «Немає взятих кредитів».</w:t>
+      </w:r>
+    </w:p>
+    <w:p>
+      <w:pPr>
+        <w:pStyle w:val="Common"/>
+        <w:rPr>
+          <w:lang w:val="uk-UA"/>
+        </w:rPr>
+      </w:pPr>
+      <w:r>
+        <w:rPr>
+          <w:lang w:val="uk-UA"/>
+        </w:rPr>
+      </w:r>
+    </w:p>
+    <w:p>
+      <w:pPr>
+        <w:pStyle w:val="Title3rd1"/>
+        <w:rPr/>
+      </w:pPr>
+      <w:bookmarkStart w:id="48" w:name="__RefHeading___Toc6725_2263296625"/>
+      <w:bookmarkEnd w:id="48"/>
+      <w:r>
+        <w:rPr/>
+        <w:t>Рішення</w:t>
+      </w:r>
+    </w:p>
+    <w:p>
+      <w:pPr>
+        <w:pStyle w:val="Common"/>
+        <w:rPr/>
+      </w:pPr>
+      <w:r>
+        <w:rPr/>
+      </w:r>
+    </w:p>
+    <w:p>
+      <w:pPr>
+        <w:pStyle w:val="Common"/>
+        <w:rPr>
+          <w:lang w:val="uk-UA"/>
+        </w:rPr>
+      </w:pPr>
+      <w:r>
+        <w:rPr>
+          <w:lang w:val="uk-UA"/>
+        </w:rPr>
+        <w:t xml:space="preserve">Додати рядок </w:t>
+      </w:r>
+      <w:r>
+        <w:rPr>
+          <w:lang w:val="en-US"/>
+        </w:rPr>
+        <w:t xml:space="preserve">return </w:t>
+      </w:r>
+      <w:r>
+        <w:rPr>
+          <w:lang w:val="uk-UA"/>
+        </w:rPr>
+        <w:t>до наступних місць:</w:t>
+      </w:r>
+    </w:p>
+    <w:p>
+      <w:pPr>
+        <w:pStyle w:val="Common"/>
+        <w:rPr>
+          <w:lang w:val="uk-UA"/>
+        </w:rPr>
+      </w:pPr>
+      <w:r>
+        <w:rPr>
+          <w:lang w:val="uk-UA"/>
+        </w:rPr>
+      </w:r>
+    </w:p>
+    <w:p>
+      <w:pPr>
+        <w:pStyle w:val="Code"/>
+        <w:rPr/>
+      </w:pPr>
+      <w:r>
+        <w:rPr/>
+        <w:t>@ui.refreshable</w:t>
+      </w:r>
+    </w:p>
+    <w:p>
+      <w:pPr>
+        <w:pStyle w:val="Code"/>
+        <w:rPr/>
+      </w:pPr>
+      <w:r>
+        <w:rPr/>
+        <w:t>def loans_view():</w:t>
+      </w:r>
+    </w:p>
+    <w:p>
+      <w:pPr>
+        <w:pStyle w:val="Code"/>
+        <w:rPr/>
+      </w:pPr>
+      <w:r>
+        <w:rPr/>
+        <w:t xml:space="preserve">    </w:t>
+      </w:r>
+      <w:r>
+        <w:rPr/>
+        <w:t># Якщо немає взятих кредитів</w:t>
+      </w:r>
+    </w:p>
+    <w:p>
+      <w:pPr>
+        <w:pStyle w:val="Code"/>
+        <w:rPr/>
+      </w:pPr>
+      <w:r>
+        <w:rPr/>
+        <w:t xml:space="preserve">    </w:t>
+      </w:r>
+      <w:r>
+        <w:rPr/>
+        <w:t>if not State.taken_loans:</w:t>
+      </w:r>
+    </w:p>
+    <w:p>
+      <w:pPr>
+        <w:pStyle w:val="Code"/>
+        <w:rPr/>
+      </w:pPr>
+      <w:r>
+        <w:rPr/>
+        <w:t xml:space="preserve">        </w:t>
+      </w:r>
+      <w:r>
+        <w:rPr/>
+        <w:t># Повідомити про це користувача</w:t>
+      </w:r>
+    </w:p>
+    <w:p>
+      <w:pPr>
+        <w:pStyle w:val="Code"/>
+        <w:rPr/>
+      </w:pPr>
+      <w:r>
+        <w:rPr/>
+        <w:t xml:space="preserve">        </w:t>
+      </w:r>
+      <w:r>
+        <w:rPr/>
+        <w:t>ui.label("Немає взятих кредитів.")</w:t>
+      </w:r>
+    </w:p>
+    <w:p>
+      <w:pPr>
+        <w:pStyle w:val="Code"/>
+        <w:rPr/>
+      </w:pPr>
+      <w:r>
+        <w:rPr/>
+        <w:t xml:space="preserve">        </w:t>
+      </w:r>
+      <w:r>
+        <w:rPr/>
+        <w:t>return</w:t>
+      </w:r>
+    </w:p>
+    <w:p>
+      <w:pPr>
+        <w:pStyle w:val="Common"/>
+        <w:rPr>
+          <w:lang w:val="uk-UA"/>
+        </w:rPr>
+      </w:pPr>
+      <w:r>
+        <w:rPr>
+          <w:lang w:val="uk-UA"/>
+        </w:rPr>
+      </w:r>
+    </w:p>
+    <w:p>
+      <w:pPr>
+        <w:pStyle w:val="Common"/>
+        <w:rPr>
+          <w:lang w:val="uk-UA"/>
+        </w:rPr>
+      </w:pPr>
+      <w:r>
+        <w:rPr>
+          <w:lang w:val="uk-UA"/>
+        </w:rPr>
+        <w:t>Та:</w:t>
+      </w:r>
+    </w:p>
+    <w:p>
+      <w:pPr>
+        <w:pStyle w:val="Common"/>
+        <w:rPr>
+          <w:lang w:val="uk-UA"/>
+        </w:rPr>
+      </w:pPr>
+      <w:r>
+        <w:rPr>
+          <w:lang w:val="uk-UA"/>
+        </w:rPr>
+      </w:r>
+    </w:p>
+    <w:p>
+      <w:pPr>
+        <w:pStyle w:val="Code"/>
+        <w:rPr/>
+      </w:pPr>
+      <w:r>
+        <w:rPr/>
+        <w:t>@ui.refreshable</w:t>
+      </w:r>
+    </w:p>
+    <w:p>
+      <w:pPr>
+        <w:pStyle w:val="Code"/>
+        <w:rPr/>
+      </w:pPr>
+      <w:r>
+        <w:rPr/>
+        <w:t>def owned_trucks_view():</w:t>
+      </w:r>
+    </w:p>
+    <w:p>
+      <w:pPr>
+        <w:pStyle w:val="Code"/>
+        <w:rPr/>
+      </w:pPr>
+      <w:r>
+        <w:rPr/>
+        <w:t xml:space="preserve">    </w:t>
+      </w:r>
+      <w:r>
+        <w:rPr/>
+        <w:t>if not State.owned_trucks:</w:t>
+      </w:r>
+    </w:p>
+    <w:p>
+      <w:pPr>
+        <w:pStyle w:val="Code"/>
+        <w:rPr/>
+      </w:pPr>
+      <w:r>
+        <w:rPr/>
+        <w:t xml:space="preserve">        </w:t>
+      </w:r>
+      <w:r>
+        <w:rPr/>
+        <w:t>ui.label("Немає придбаних вантажівок.")</w:t>
+      </w:r>
+    </w:p>
+    <w:p>
+      <w:pPr>
+        <w:pStyle w:val="Code"/>
+        <w:rPr/>
+      </w:pPr>
+      <w:r>
+        <w:rPr/>
+        <w:t xml:space="preserve">        </w:t>
+      </w:r>
+      <w:r>
+        <w:rPr/>
+        <w:t>return</w:t>
+      </w:r>
+    </w:p>
+    <w:p>
+      <w:pPr>
+        <w:pStyle w:val="Common"/>
+        <w:rPr>
+          <w:lang w:val="uk-UA"/>
+        </w:rPr>
+      </w:pPr>
+      <w:r>
+        <w:rPr>
+          <w:lang w:val="uk-UA"/>
+        </w:rPr>
+      </w:r>
+    </w:p>
+    <w:p>
+      <w:pPr>
+        <w:pStyle w:val="Title2nd1"/>
+        <w:rPr/>
+      </w:pPr>
+      <w:bookmarkStart w:id="49" w:name="__RefHeading___Toc6727_2263296625"/>
+      <w:bookmarkEnd w:id="49"/>
+      <w:r>
+        <w:rPr/>
+        <w:t>6 Виправлення типу змінної</w:t>
+      </w:r>
+    </w:p>
+    <w:p>
+      <w:pPr>
+        <w:pStyle w:val="Title3rd1"/>
+        <w:rPr/>
+      </w:pPr>
+      <w:bookmarkStart w:id="50" w:name="__RefHeading___Toc6729_2263296625"/>
+      <w:bookmarkEnd w:id="50"/>
+      <w:r>
+        <w:rPr/>
+        <w:t>Завдання</w:t>
+      </w:r>
+    </w:p>
+    <w:p>
+      <w:pPr>
+        <w:pStyle w:val="Common"/>
+        <w:rPr>
+          <w:lang w:val="uk-UA"/>
+        </w:rPr>
+      </w:pPr>
+      <w:r>
+        <w:rPr>
+          <w:lang w:val="uk-UA"/>
+        </w:rPr>
+      </w:r>
+    </w:p>
+    <w:p>
+      <w:pPr>
+        <w:pStyle w:val="Common"/>
+        <w:rPr>
+          <w:lang w:val="uk-UA"/>
+        </w:rPr>
+      </w:pPr>
+      <w:r>
+        <w:rPr>
+          <w:lang w:val="uk-UA"/>
+        </w:rPr>
+        <w:t>selected_truck: ITruck = None має бути Optional[ITruck].</w:t>
+      </w:r>
+    </w:p>
+    <w:p>
+      <w:pPr>
+        <w:pStyle w:val="Common"/>
+        <w:rPr>
+          <w:lang w:val="uk-UA"/>
+        </w:rPr>
+      </w:pPr>
+      <w:r>
+        <w:rPr>
+          <w:lang w:val="uk-UA"/>
+        </w:rPr>
+      </w:r>
+    </w:p>
+    <w:p>
+      <w:pPr>
+        <w:pStyle w:val="Title3rd1"/>
+        <w:rPr/>
+      </w:pPr>
+      <w:bookmarkStart w:id="51" w:name="__RefHeading___Toc6731_2263296625"/>
+      <w:bookmarkEnd w:id="51"/>
+      <w:r>
+        <w:rPr/>
+        <w:t>Рішення</w:t>
+      </w:r>
+    </w:p>
+    <w:p>
+      <w:pPr>
+        <w:pStyle w:val="Common"/>
+        <w:rPr>
+          <w:lang w:val="uk-UA"/>
+        </w:rPr>
+      </w:pPr>
+      <w:r>
+        <w:rPr>
+          <w:lang w:val="uk-UA"/>
+        </w:rPr>
+      </w:r>
+    </w:p>
+    <w:p>
+      <w:pPr>
+        <w:pStyle w:val="Common"/>
+        <w:rPr>
+          <w:lang w:val="uk-UA"/>
+        </w:rPr>
+      </w:pPr>
+      <w:r>
+        <w:rPr>
+          <w:lang w:val="uk-UA"/>
+        </w:rPr>
+        <w:t>Замінити рядок:</w:t>
+      </w:r>
+    </w:p>
+    <w:p>
+      <w:pPr>
+        <w:pStyle w:val="Common"/>
+        <w:rPr>
+          <w:lang w:val="uk-UA"/>
+        </w:rPr>
+      </w:pPr>
+      <w:r>
+        <w:rPr>
+          <w:lang w:val="uk-UA"/>
+        </w:rPr>
+      </w:r>
+    </w:p>
+    <w:p>
+      <w:pPr>
+        <w:pStyle w:val="Code"/>
+        <w:rPr/>
+      </w:pPr>
+      <w:r>
+        <w:rPr/>
+        <w:t>selected_truck: ITruck = None</w:t>
+      </w:r>
+    </w:p>
+    <w:p>
+      <w:pPr>
+        <w:pStyle w:val="Common"/>
+        <w:rPr>
+          <w:lang w:val="uk-UA"/>
+        </w:rPr>
+      </w:pPr>
+      <w:r>
+        <w:rPr>
+          <w:lang w:val="uk-UA"/>
+        </w:rPr>
+      </w:r>
+    </w:p>
+    <w:p>
+      <w:pPr>
+        <w:pStyle w:val="Common"/>
+        <w:rPr>
+          <w:lang w:val="uk-UA"/>
+        </w:rPr>
+      </w:pPr>
+      <w:r>
+        <w:rPr>
+          <w:lang w:val="uk-UA"/>
+        </w:rPr>
+        <w:t>На наступний:</w:t>
+      </w:r>
+    </w:p>
+    <w:p>
+      <w:pPr>
+        <w:pStyle w:val="Common"/>
+        <w:rPr>
+          <w:lang w:val="uk-UA"/>
+        </w:rPr>
+      </w:pPr>
+      <w:r>
+        <w:rPr>
+          <w:lang w:val="uk-UA"/>
+        </w:rPr>
+      </w:r>
+    </w:p>
+    <w:p>
+      <w:pPr>
+        <w:pStyle w:val="Code"/>
+        <w:rPr/>
+      </w:pPr>
+      <w:r>
+        <w:rPr/>
+        <w:t>selected_truck: Optional[ITruck] = None</w:t>
+      </w:r>
+    </w:p>
+    <w:p>
+      <w:pPr>
+        <w:pStyle w:val="Common"/>
+        <w:rPr>
+          <w:lang w:val="uk-UA"/>
+        </w:rPr>
+      </w:pPr>
+      <w:r>
+        <w:rPr>
+          <w:lang w:val="uk-UA"/>
+        </w:rPr>
+      </w:r>
+    </w:p>
+    <w:p>
+      <w:pPr>
+        <w:pStyle w:val="Title2nd1"/>
+        <w:rPr/>
+      </w:pPr>
+      <w:bookmarkStart w:id="52" w:name="__RefHeading___Toc6733_2263296625"/>
+      <w:bookmarkEnd w:id="52"/>
+      <w:r>
+        <w:rPr/>
+        <w:t>7 Додавання обробників помилок до запитів бази даних</w:t>
+      </w:r>
+    </w:p>
+    <w:p>
+      <w:pPr>
+        <w:pStyle w:val="Title3rd1"/>
+        <w:rPr/>
+      </w:pPr>
+      <w:bookmarkStart w:id="53" w:name="__RefHeading___Toc6735_2263296625"/>
+      <w:bookmarkEnd w:id="53"/>
+      <w:r>
+        <w:rPr/>
+        <w:t>Завдання</w:t>
+      </w:r>
+    </w:p>
+    <w:p>
+      <w:pPr>
+        <w:pStyle w:val="Common"/>
+        <w:rPr>
+          <w:lang w:val="uk-UA"/>
+        </w:rPr>
+      </w:pPr>
+      <w:r>
+        <w:rPr>
+          <w:lang w:val="uk-UA"/>
+        </w:rPr>
+      </w:r>
+    </w:p>
+    <w:p>
+      <w:pPr>
+        <w:pStyle w:val="Common"/>
+        <w:rPr>
+          <w:lang w:val="uk-UA"/>
+        </w:rPr>
+      </w:pPr>
+      <w:r>
+        <w:rPr>
+          <w:lang w:val="uk-UA"/>
+        </w:rPr>
+        <w:t>Немає обробки помилок навколо запитів до БД.</w:t>
+      </w:r>
+    </w:p>
+    <w:p>
+      <w:pPr>
+        <w:pStyle w:val="Common"/>
+        <w:rPr>
+          <w:lang w:val="uk-UA"/>
+        </w:rPr>
+      </w:pPr>
+      <w:r>
+        <w:rPr>
+          <w:lang w:val="uk-UA"/>
+        </w:rPr>
+      </w:r>
+    </w:p>
+    <w:p>
+      <w:pPr>
+        <w:pStyle w:val="Title3rd1"/>
+        <w:rPr/>
+      </w:pPr>
+      <w:bookmarkStart w:id="54" w:name="__RefHeading___Toc6737_2263296625"/>
+      <w:bookmarkEnd w:id="54"/>
+      <w:r>
+        <w:rPr/>
+        <w:t>Рішення</w:t>
+      </w:r>
+    </w:p>
+    <w:p>
+      <w:pPr>
+        <w:pStyle w:val="Common"/>
+        <w:rPr>
+          <w:lang w:val="uk-UA"/>
+        </w:rPr>
+      </w:pPr>
+      <w:r>
+        <w:rPr>
+          <w:lang w:val="uk-UA"/>
+        </w:rPr>
+      </w:r>
+    </w:p>
+    <w:p>
+      <w:pPr>
+        <w:pStyle w:val="Common"/>
+        <w:rPr>
+          <w:lang w:val="uk-UA"/>
+        </w:rPr>
+      </w:pPr>
+      <w:r>
+        <w:rPr>
+          <w:lang w:val="uk-UA"/>
+        </w:rPr>
+        <w:t xml:space="preserve">Додати обробники помилок у наступних місцях фалу </w:t>
+      </w:r>
+      <w:r>
+        <w:rPr>
+          <w:lang w:val="en-US"/>
+        </w:rPr>
+        <w:t>data.py:</w:t>
+      </w:r>
+    </w:p>
+    <w:p>
+      <w:pPr>
+        <w:pStyle w:val="Common"/>
+        <w:rPr>
+          <w:lang w:val="en-US"/>
+        </w:rPr>
+      </w:pPr>
+      <w:r>
+        <w:rPr>
+          <w:lang w:val="en-US"/>
+        </w:rPr>
+      </w:r>
+    </w:p>
+    <w:p>
+      <w:pPr>
+        <w:pStyle w:val="Code"/>
+        <w:rPr/>
+      </w:pPr>
+      <w:r>
+        <w:rPr/>
+        <w:t>try:</w:t>
+      </w:r>
+    </w:p>
+    <w:p>
+      <w:pPr>
+        <w:pStyle w:val="Code"/>
+        <w:rPr/>
+      </w:pPr>
+      <w:r>
+        <w:rPr/>
+        <w:tab/>
+        <w:t>all_trucks_query = Truck.select()</w:t>
+      </w:r>
+    </w:p>
+    <w:p>
+      <w:pPr>
+        <w:pStyle w:val="Code"/>
+        <w:rPr/>
+      </w:pPr>
+      <w:r>
+        <w:rPr/>
+        <w:t>except Exception:</w:t>
+      </w:r>
+    </w:p>
+    <w:p>
+      <w:pPr>
+        <w:pStyle w:val="Code"/>
+        <w:rPr/>
+      </w:pPr>
+      <w:r>
+        <w:rPr/>
+        <w:tab/>
+        <w:t>print("ERROR: Failed to fetch the database.")</w:t>
+      </w:r>
+    </w:p>
+    <w:p>
+      <w:pPr>
+        <w:pStyle w:val="Code"/>
+        <w:rPr/>
+      </w:pPr>
+      <w:r>
+        <w:rPr/>
+        <w:tab/>
+        <w:t>return</w:t>
+      </w:r>
+    </w:p>
+    <w:p>
+      <w:pPr>
+        <w:pStyle w:val="Common"/>
+        <w:rPr>
+          <w:lang w:val="uk-UA"/>
+        </w:rPr>
+      </w:pPr>
+      <w:r>
+        <w:rPr>
+          <w:lang w:val="uk-UA"/>
+        </w:rPr>
+      </w:r>
+    </w:p>
+    <w:p>
+      <w:pPr>
+        <w:pStyle w:val="Code"/>
+        <w:rPr/>
+      </w:pPr>
+      <w:r>
+        <w:rPr/>
+        <w:t>try:</w:t>
+      </w:r>
+    </w:p>
+    <w:p>
+      <w:pPr>
+        <w:pStyle w:val="Code"/>
+        <w:rPr/>
+      </w:pPr>
+      <w:r>
+        <w:rPr/>
+        <w:tab/>
+        <w:t>all_loans_query = Loan.select()</w:t>
+      </w:r>
+    </w:p>
+    <w:p>
+      <w:pPr>
+        <w:pStyle w:val="Code"/>
+        <w:rPr/>
+      </w:pPr>
+      <w:r>
+        <w:rPr/>
+        <w:t>except Exception:</w:t>
+      </w:r>
+    </w:p>
+    <w:p>
+      <w:pPr>
+        <w:pStyle w:val="Code"/>
+        <w:rPr/>
+      </w:pPr>
+      <w:r>
+        <w:rPr/>
+        <w:tab/>
+        <w:t>print("ERROR: Failed to fetch the database.")</w:t>
+      </w:r>
+    </w:p>
+    <w:p>
+      <w:pPr>
+        <w:pStyle w:val="Code"/>
+        <w:rPr/>
+      </w:pPr>
+      <w:r>
+        <w:rPr/>
+        <w:tab/>
+        <w:t>return</w:t>
+      </w:r>
+    </w:p>
+    <w:p>
+      <w:pPr>
+        <w:pStyle w:val="Common"/>
+        <w:rPr>
+          <w:lang w:val="en-US"/>
+        </w:rPr>
+      </w:pPr>
+      <w:r>
+        <w:rPr>
+          <w:lang w:val="en-US"/>
+        </w:rPr>
+      </w:r>
+    </w:p>
+    <w:p>
+      <w:pPr>
+        <w:pStyle w:val="Code"/>
+        <w:rPr/>
+      </w:pPr>
+      <w:r>
+        <w:rPr/>
+        <w:t>try:</w:t>
+      </w:r>
+    </w:p>
+    <w:p>
+      <w:pPr>
+        <w:pStyle w:val="Code"/>
+        <w:rPr/>
+      </w:pPr>
+      <w:r>
+        <w:rPr/>
+        <w:tab/>
+        <w:t>all_orders_query = Order.select()</w:t>
+      </w:r>
+    </w:p>
+    <w:p>
+      <w:pPr>
+        <w:pStyle w:val="Code"/>
+        <w:rPr/>
+      </w:pPr>
+      <w:r>
+        <w:rPr/>
+        <w:t>except Exception:</w:t>
+      </w:r>
+    </w:p>
+    <w:p>
+      <w:pPr>
+        <w:pStyle w:val="Code"/>
+        <w:rPr/>
+      </w:pPr>
+      <w:r>
+        <w:rPr/>
+        <w:tab/>
+        <w:t>print("ERROR: Failed to fetch the database.")</w:t>
+      </w:r>
+    </w:p>
+    <w:p>
+      <w:pPr>
+        <w:pStyle w:val="Code"/>
+        <w:rPr/>
+      </w:pPr>
+      <w:r>
+        <w:rPr/>
+        <w:tab/>
+        <w:t>return</w:t>
+      </w:r>
+    </w:p>
+    <w:p>
+      <w:pPr>
+        <w:pStyle w:val="Common"/>
+        <w:rPr>
+          <w:lang w:val="uk-UA"/>
+        </w:rPr>
+      </w:pPr>
+      <w:r>
+        <w:rPr>
+          <w:lang w:val="uk-UA"/>
+        </w:rPr>
       </w:r>
       <w:r>
         <w:br w:type="page"/>
@@ -2170,8 +4302,8 @@
         <w:spacing w:before="0" w:after="600"/>
         <w:rPr/>
       </w:pPr>
-      <w:bookmarkStart w:id="34" w:name="__RefHeading___Toc16733_2705807760"/>
-      <w:bookmarkEnd w:id="34"/>
+      <w:bookmarkStart w:id="55" w:name="__RefHeading___Toc16733_2705807760"/>
+      <w:bookmarkEnd w:id="55"/>
       <w:r>
         <w:rPr/>
         <w:t>6 Прийняття роботи</w:t>
@@ -2180,10 +4312,15 @@
     <w:p>
       <w:pPr>
         <w:pStyle w:val="Common"/>
-        <w:rPr/>
-      </w:pPr>
-      <w:r>
-        <w:rPr/>
+        <w:rPr>
+          <w:lang w:val="uk-UA"/>
+        </w:rPr>
+      </w:pPr>
+      <w:r>
+        <w:rPr>
+          <w:lang w:val="uk-UA"/>
+        </w:rPr>
+        <w:t>Роботу надіслано до керівника практики.</w:t>
       </w:r>
       <w:r>
         <w:br w:type="page"/>
@@ -2195,8 +4332,8 @@
         <w:spacing w:before="0" w:after="600"/>
         <w:rPr/>
       </w:pPr>
-      <w:bookmarkStart w:id="35" w:name="__RefHeading___Toc16696_2705807760"/>
-      <w:bookmarkEnd w:id="35"/>
+      <w:bookmarkStart w:id="56" w:name="__RefHeading___Toc16696_2705807760"/>
+      <w:bookmarkEnd w:id="56"/>
       <w:r>
         <w:rPr/>
         <w:t>Список використаних джерел</w:t>
@@ -2306,7 +4443,7 @@
     </w:r>
     <w:r>
       <w:rPr/>
-      <w:t>11</w:t>
+      <w:t>15</w:t>
     </w:r>
     <w:r>
       <w:rPr/>
@@ -3630,6 +5767,13 @@
     <w:qFormat/>
     <w:rPr/>
   </w:style>
+  <w:style w:type="character" w:styleId="user1">
+    <w:name w:val="Первинний текст (user)"/>
+    <w:qFormat/>
+    <w:rPr>
+      <w:rFonts w:ascii="Liberation Mono" w:hAnsi="Liberation Mono" w:eastAsia="Liberation Mono" w:cs="Liberation Mono"/>
+    </w:rPr>
+  </w:style>
   <w:style w:type="paragraph" w:styleId="Style19">
     <w:name w:val="Заголовок"/>
     <w:basedOn w:val="Normal"/>
@@ -3688,7 +5832,7 @@
       <w:rFonts w:cs="Arial Unicode MS"/>
     </w:rPr>
   </w:style>
-  <w:style w:type="paragraph" w:styleId="user1">
+  <w:style w:type="paragraph" w:styleId="user2">
     <w:name w:val="Заголовок (user)"/>
     <w:basedOn w:val="Normal"/>
     <w:next w:val="BodyText"/>
@@ -3703,7 +5847,7 @@
       <w:szCs w:val="28"/>
     </w:rPr>
   </w:style>
-  <w:style w:type="paragraph" w:styleId="user2">
+  <w:style w:type="paragraph" w:styleId="user3">
     <w:name w:val="Покажчик (user)"/>
     <w:basedOn w:val="Normal"/>
     <w:qFormat/>
@@ -3926,7 +6070,7 @@
       <w:szCs w:val="16"/>
     </w:rPr>
   </w:style>
-  <w:style w:type="paragraph" w:styleId="user3">
+  <w:style w:type="paragraph" w:styleId="user4">
     <w:name w:val="Верхній і нижній колонтитули (user)"/>
     <w:basedOn w:val="Normal"/>
     <w:qFormat/>
@@ -4370,7 +6514,7 @@
       <w:bCs/>
     </w:rPr>
   </w:style>
-  <w:style w:type="paragraph" w:styleId="user4">
+  <w:style w:type="paragraph" w:styleId="user5">
     <w:name w:val="Вміст таблиці (user)"/>
     <w:basedOn w:val="Normal"/>
     <w:qFormat/>

</xml_diff>